<commit_message>
1421 docs and Programmer: AT+BOOTLOADER_PIN=<0|1>,DEADBEE
README, Programmer README and pass-through warning, console README,
AGENTS.md and the m1421 datasheet now show the password form. The README
explains the password rule and what each CCFG WRITE FAILED case means and
how to recover. The datasheet gains a password parameter row and the
verified-CRC response line.
</commit_message>
<xml_diff>
--- a/word/datasheet_adsbee_m1421.docx
+++ b/word/datasheet_adsbee_m1421.docx
@@ -9706,7 +9706,7 @@
     </w:p>
     <w:p>
       <w:r>
-        <w:t xml:space="preserve">Enables or disables the bootloader backdoor in the CC1314 CCFG (customer configuration) flash. With the backdoor enabled, which is the factory default, holding SYNC high while ~SRST is pulsed low starts the CC1314 ROM UART bootloader on pins DIO_2/DIO_3. The ADSBee 1421 Programmer and other host tools use this to reflash the module. The setting takes effect at the next reset and persists across power cycles and AT+SETTINGS=RESET.</w:t>
+        <w:t xml:space="preserve">Enables or disables the bootloader backdoor in the CC1314 CCFG (customer configuration) flash. With the backdoor enabled, which is the factory default, holding SYNC high while ~SRST is pulsed low starts the CC1314 ROM UART bootloader on pins DIO_2/DIO_3. The ADSBee 1421 Programmer and other host tools use this to reflash the module. The setting takes effect at the next reset and persists across power cycles and AT+SETTINGS=RESET. Every write is read back and verified; a write that fails prints a CCFG WRITE FAILED error banner with the read-back value and the recovery steps, and returns ERROR.</w:t>
       </w:r>
     </w:p>
     <w:p>
@@ -9718,7 +9718,7 @@
         <w:t xml:space="preserve">Warning: </w:t>
       </w:r>
       <w:r>
-        <w:t xml:space="preserve">With the backdoor disabled, SYNC no longer enters the bootloader, so the ADSBee 1421 Programmer and other SYNC-based tools cannot reflash the module. The Programmer (0.3.11-rc4 and later) still bridges the console, without checking the image, so AT+BOOTLOADER_PIN=1 can be sent through it. The only ways to enable it again are AT+BOOTLOADER_PIN=1 sent to the running firmware, or a JTAG flash. Flashing a complete firmware image writes that image's CCFG, which has the backdoor enabled in every release.</w:t>
+        <w:t xml:space="preserve">With the backdoor disabled, SYNC no longer enters the bootloader, so the ADSBee 1421 Programmer and other SYNC-based tools cannot reflash the module. The Programmer (0.3.11-rc4 and later) still bridges the console, without checking the image, so AT+BOOTLOADER_PIN=1,DEADBEE can be sent through it. The only ways to enable it again are AT+BOOTLOADER_PIN=1,DEADBEE sent to the running firmware, or a JTAG flash. Flashing a complete firmware image writes that image's CCFG, which has the backdoor enabled in every release.</w:t>
       </w:r>
     </w:p>
     <w:p>
@@ -9738,7 +9738,7 @@
         <w:pStyle w:val="code"/>
       </w:pPr>
       <w:r>
-        <w:t xml:space="preserve">AT+BOOTLOADER_PIN=&lt;enabled&gt;[,DRYRUN]</w:t>
+        <w:t xml:space="preserve">AT+BOOTLOADER_PIN=&lt;enabled&gt;,&lt;password&gt;[,DRYRUN]</w:t>
       </w:r>
     </w:p>
     <w:p>
@@ -9747,6 +9747,14 @@
       </w:pPr>
       <w:r>
         <w:t xml:space="preserve">BL_CONFIG 0xC5FF0500 -&gt; 0xC5FF05C5: erase and reprogram the CCFG sector</w:t>
+      </w:r>
+    </w:p>
+    <w:p>
+      <w:pPr>
+        <w:pStyle w:val="code"/>
+      </w:pPr>
+      <w:r>
+        <w:t xml:space="preserve">CCFG verified: BL_CONFIG 0xC5FF05C5, CCFG CRC32 0x66E9858D.</w:t>
       </w:r>
     </w:p>
     <w:p>
@@ -9867,6 +9875,38 @@
           <w:p>
             <w:r>
               <w:t xml:space="preserve">0, 1</w:t>
+            </w:r>
+          </w:p>
+        </w:tc>
+      </w:tr>
+      <w:tr>
+        <w:tc>
+          <w:tcPr>
+            <w:tcW w:w="2200" w:type="dxa"/>
+          </w:tcPr>
+          <w:p>
+            <w:r>
+              <w:t xml:space="preserve">password</w:t>
+            </w:r>
+          </w:p>
+        </w:tc>
+        <w:tc>
+          <w:tcPr>
+            <w:tcW w:w="6160" w:type="dxa"/>
+          </w:tcPr>
+          <w:p>
+            <w:r>
+              <w:t xml:space="preserve">Required for every set form, DRYRUN included, so the CCFG is only written on purpose. A missing or wrong password returns ERROR and leaves the CCFG untouched. Queries need no password.</w:t>
+            </w:r>
+          </w:p>
+        </w:tc>
+        <w:tc>
+          <w:tcPr>
+            <w:tcW w:w="2440" w:type="dxa"/>
+          </w:tcPr>
+          <w:p>
+            <w:r>
+              <w:t xml:space="preserve">DEADBEE</w:t>
             </w:r>
           </w:p>
         </w:tc>

</xml_diff>

<commit_message>
Export 1090 and m1421 datasheets
</commit_message>
<xml_diff>
--- a/word/datasheet_adsbee_m1421.docx
+++ b/word/datasheet_adsbee_m1421.docx
@@ -21,7 +21,7 @@
         <w:rPr>
           <w:noProof/>
         </w:rPr>
-        <w:pict w14:anchorId="085390A5">
+        <w:pict w14:anchorId="374B7A2D">
           <v:shapetype id="_x0000_t202" coordsize="21600,21600" o:spt="202" path="m,l,21600r21600,l21600,xe">
             <v:stroke joinstyle="miter"/>
             <v:path gradientshapeok="t" o:connecttype="rect"/>
@@ -887,7 +887,7 @@
                 <w:noProof/>
                 <w:webHidden/>
               </w:rPr>
-              <w:t>5</w:t>
+              <w:t>4</w:t>
             </w:r>
             <w:r>
               <w:rPr>
@@ -7442,7 +7442,7 @@
     </w:p>
     <w:p>
       <w:r>
-        <w:t>20260818</w:t>
+        <w:t>20260516</w:t>
       </w:r>
     </w:p>
     <w:p>
@@ -7454,7 +7454,7 @@
         </w:numPr>
       </w:pPr>
       <w:r>
-        <w:t>Added AT+SUBG_MODE for selecting the Sub-GHz receiver mode (UAT_RX / UAT_RX_NO_UPLINK, disables UAT uplink reception). AT+RX_ENABLE now powers the Sub-GHz receiver down when disabled.</w:t>
+        <w:t>Initial release.</w:t>
       </w:r>
     </w:p>
     <w:p>
@@ -7471,12 +7471,7 @@
         </w:numPr>
       </w:pPr>
       <w:r>
-        <w:t>Documented the serial command interface and reporting protocols. Renamed the 1090 MHz commands to the R1090_ prefix and added RX_STATS.</w:t>
-      </w:r>
-    </w:p>
-    <w:p>
-      <w:r>
-        <w:t>20260516</w:t>
+        <w:t>Add detailed protocol descriptions.</w:t>
       </w:r>
     </w:p>
     <w:p>
@@ -7488,12 +7483,11 @@
         </w:numPr>
       </w:pPr>
       <w:r>
-        <w:t>Initial release.</w:t>
-      </w:r>
-    </w:p>
-    <w:p>
-      <w:r>
-        <w:t>20260606</w:t>
+        <w:t>Revise power estimate</w:t>
+      </w:r>
+      <w:bookmarkStart w:id="4" w:name="_Toc237911178"/>
+      <w:r>
+        <w:t>.</w:t>
       </w:r>
     </w:p>
     <w:p>
@@ -7505,7 +7499,12 @@
         </w:numPr>
       </w:pPr>
       <w:r>
-        <w:t>Add detailed protocol descriptions.</w:t>
+        <w:t>Documented the serial command interface and reporting protocols. Renamed the 1090 MHz commands to the R1090_ prefix and added RX_STATS.</w:t>
+      </w:r>
+    </w:p>
+    <w:p>
+      <w:r>
+        <w:t>20260818</w:t>
       </w:r>
     </w:p>
     <w:p>
@@ -7517,8 +7516,20 @@
         </w:numPr>
       </w:pPr>
       <w:r>
-        <w:t>Revise power estimate.</w:t>
-      </w:r>
+        <w:t>Added AT+SUBG_MODE for selecting the Sub-GHz receiver mode (UAT_RX / UAT_RX_NO_UPLINK, disables UAT uplink reception). AT+RX_ENABLE now powers the Sub-GHz receiver down when disabled.</w:t>
+      </w:r>
+    </w:p>
+    <w:p/>
+    <w:p>
+      <w:pPr>
+        <w:rPr>
+          <w:rFonts w:ascii="Poppins SemiBold" w:eastAsiaTheme="majorEastAsia" w:hAnsi="Poppins SemiBold" w:cstheme="majorBidi"/>
+          <w:b/>
+          <w:color w:val="00AD4D"/>
+          <w:sz w:val="32"/>
+          <w:szCs w:val="32"/>
+        </w:rPr>
+      </w:pPr>
       <w:r>
         <w:br w:type="page"/>
       </w:r>
@@ -7526,12 +7537,7 @@
     <w:p>
       <w:pPr>
         <w:pStyle w:val="Heading1"/>
-        <w:numPr>
-          <w:ilvl w:val="0"/>
-          <w:numId w:val="4"/>
-        </w:numPr>
       </w:pPr>
-      <w:bookmarkStart w:id="4" w:name="_Toc237911178"/>
       <w:r>
         <w:lastRenderedPageBreak/>
         <w:t>Overview</w:t>
@@ -9119,19 +9125,7 @@
         <w:rPr>
           <w:noProof/>
         </w:rPr>
-        <w:instrText xml:space="preserve"> </w:instrText>
-      </w:r>
-      <w:r>
-        <w:rPr>
-          <w:noProof/>
-        </w:rPr>
-        <w:instrText>INCLUDEPICTURE  "http://10.42.2.218/scrprint.png?reload=0&amp;format=0&amp;mode=0" \* MERGEFORMATINET</w:instrText>
-      </w:r>
-      <w:r>
-        <w:rPr>
-          <w:noProof/>
-        </w:rPr>
-        <w:instrText xml:space="preserve"> </w:instrText>
+        <w:instrText xml:space="preserve"> INCLUDEPICTURE  "http://10.42.2.218/scrprint.png?reload=0&amp;format=0&amp;mode=0" \* MERGEFORMATINET </w:instrText>
       </w:r>
       <w:r>
         <w:rPr>
@@ -9143,7 +9137,25 @@
         <w:rPr>
           <w:noProof/>
         </w:rPr>
-        <w:pict w14:anchorId="66511708">
+        <w:fldChar w:fldCharType="begin"/>
+      </w:r>
+      <w:r>
+        <w:rPr>
+          <w:noProof/>
+        </w:rPr>
+        <w:instrText xml:space="preserve"> INCLUDEPICTURE  "http://10.42.2.218/scrprint.png?reload=0&amp;format=0&amp;mode=0" \* MERGEFORMATINET </w:instrText>
+      </w:r>
+      <w:r>
+        <w:rPr>
+          <w:noProof/>
+        </w:rPr>
+        <w:fldChar w:fldCharType="separate"/>
+      </w:r>
+      <w:r>
+        <w:rPr>
+          <w:noProof/>
+        </w:rPr>
+        <w:pict w14:anchorId="5C05FBD5">
           <v:shapetype id="_x0000_t75" coordsize="21600,21600" o:spt="75" o:preferrelative="t" path="m@4@5l@4@11@9@11@9@5xe" filled="f" stroked="f">
             <v:stroke joinstyle="miter"/>
             <v:formulas>
@@ -9167,6 +9179,12 @@
             <v:imagedata r:id="rId18" r:href="rId19"/>
           </v:shape>
         </w:pict>
+      </w:r>
+      <w:r>
+        <w:rPr>
+          <w:noProof/>
+        </w:rPr>
+        <w:fldChar w:fldCharType="end"/>
       </w:r>
       <w:r>
         <w:rPr>
@@ -9706,7 +9724,7 @@
     </w:p>
     <w:p>
       <w:r>
-        <w:t xml:space="preserve">Enables or disables the bootloader backdoor in the CC1314 CCFG (customer configuration) flash. With the backdoor enabled, which is the factory default, holding SYNC high while ~SRST is pulsed low starts the CC1314 ROM UART bootloader on pins DIO_2/DIO_3. The ADSBee 1421 Programmer and other host tools use this to reflash the module. The setting takes effect at the next reset and persists across power cycles and AT+SETTINGS=RESET. Every write is read back and verified; a write that fails prints a CCFG WRITE FAILED error banner with the read-back value and the recovery steps, and returns ERROR.</w:t>
+        <w:t>Enables or disables the bootloader backdoor in the CC1314 CCFG (customer configuration) flash. With the backdoor enabled, which is the factory default, holding SYNC high while ~SRST is pulsed low starts the CC1314 ROM UART bootloader on pins DIO_2/DIO_3. The ADSBee 1421 Programmer and other host tools use this to reflash the module. The setting takes effect at the next reset and persists across power cycles and AT+SETTINGS=RESET. Every write is read back and verified; a write that fails prints a CCFG WRITE FAILED error banner with the read-back value and the recovery steps, and returns ERROR.</w:t>
       </w:r>
     </w:p>
     <w:p>
@@ -9718,7 +9736,7 @@
         <w:t xml:space="preserve">Warning: </w:t>
       </w:r>
       <w:r>
-        <w:t xml:space="preserve">With the backdoor disabled, SYNC no longer enters the bootloader, so the ADSBee 1421 Programmer and other SYNC-based tools cannot reflash the module. The Programmer (0.3.11-rc4 and later) still bridges the console, without checking the image, so AT+BOOTLOADER_PIN=1,DEADBEE can be sent through it. The only ways to enable it again are AT+BOOTLOADER_PIN=1,DEADBEE sent to the running firmware, or a JTAG flash. Flashing a complete firmware image writes that image's CCFG, which has the backdoor enabled in every release.</w:t>
+        <w:t>With the backdoor disabled, SYNC no longer enters the bootloader, so the ADSBee 1421 Programmer and other SYNC-based tools cannot reflash the module. The Programmer (0.3.11-rc4 and later) still bridges the console, without checking the image, so AT+BOOTLOADER_PIN=1,DEADBEE can be sent through it. The only ways to enable it again are AT+BOOTLOADER_PIN=1,DEADBEE sent to the running firmware, or a JTAG flash. Flashing a complete firmware image writes that image's CCFG, which has the backdoor enabled in every release.</w:t>
       </w:r>
     </w:p>
     <w:p>
@@ -9738,7 +9756,7 @@
         <w:pStyle w:val="code"/>
       </w:pPr>
       <w:r>
-        <w:t xml:space="preserve">AT+BOOTLOADER_PIN=&lt;enabled&gt;,&lt;password&gt;[,DRYRUN]</w:t>
+        <w:t>AT+BOOTLOADER_PIN=&lt;enabled&gt;,&lt;password&gt;[,DRYRUN]</w:t>
       </w:r>
     </w:p>
     <w:p>
@@ -9746,7 +9764,7 @@
         <w:pStyle w:val="code"/>
       </w:pPr>
       <w:r>
-        <w:t xml:space="preserve">BL_CONFIG 0xC5FF0500 -&gt; 0xC5FF05C5: erase and reprogram the CCFG sector</w:t>
+        <w:t>BL_CONFIG 0xC5FF0500 -&gt; 0xC5FF05C5: erase and reprogram the CCFG sector</w:t>
       </w:r>
     </w:p>
     <w:p>
@@ -9754,7 +9772,7 @@
         <w:pStyle w:val="code"/>
       </w:pPr>
       <w:r>
-        <w:t xml:space="preserve">CCFG verified: BL_CONFIG 0xC5FF05C5, CCFG CRC32 0x66E9858D.</w:t>
+        <w:t>CCFG verified: BL_CONFIG 0xC5FF05C5, CCFG CRC32 0x66E9858D.</w:t>
       </w:r>
     </w:p>
     <w:p>
@@ -9762,7 +9780,7 @@
         <w:pStyle w:val="code"/>
       </w:pPr>
       <w:r>
-        <w:t xml:space="preserve">Bootloader backdoor enabled; takes effect at the next reset.</w:t>
+        <w:t>Bootloader backdoor enabled; takes effect at the next reset.</w:t>
       </w:r>
     </w:p>
     <w:p>
@@ -9770,7 +9788,7 @@
         <w:pStyle w:val="code"/>
       </w:pPr>
       <w:r>
-        <w:t xml:space="preserve">OK</w:t>
+        <w:t>OK</w:t>
       </w:r>
     </w:p>
     <w:p/>
@@ -9854,7 +9872,7 @@
           </w:tcPr>
           <w:p>
             <w:r>
-              <w:t xml:space="preserve">enabled</w:t>
+              <w:t>enabled</w:t>
             </w:r>
           </w:p>
         </w:tc>
@@ -9864,7 +9882,7 @@
           </w:tcPr>
           <w:p>
             <w:r>
-              <w:t xml:space="preserve">1: SYNC high while ~SRST is pulsed low starts the ROM UART bootloader. 0: SYNC is ignored at reset.</w:t>
+              <w:t>1: SYNC high while ~SRST is pulsed low starts the ROM UART bootloader. 0: SYNC is ignored at reset.</w:t>
             </w:r>
           </w:p>
         </w:tc>
@@ -9874,7 +9892,7 @@
           </w:tcPr>
           <w:p>
             <w:r>
-              <w:t xml:space="preserve">0, 1</w:t>
+              <w:t>0, 1</w:t>
             </w:r>
           </w:p>
         </w:tc>
@@ -9886,7 +9904,7 @@
           </w:tcPr>
           <w:p>
             <w:r>
-              <w:t xml:space="preserve">password</w:t>
+              <w:t>password</w:t>
             </w:r>
           </w:p>
         </w:tc>
@@ -9896,7 +9914,7 @@
           </w:tcPr>
           <w:p>
             <w:r>
-              <w:t xml:space="preserve">Required for every set form, DRYRUN included, so the CCFG is only written on purpose. A missing or wrong password returns ERROR and leaves the CCFG untouched. Queries need no password.</w:t>
+              <w:t>Required for every set form, DRYRUN included, so the CCFG is only written on purpose. A missing or wrong password returns ERROR and leaves the CCFG untouched. Queries need no password.</w:t>
             </w:r>
           </w:p>
         </w:tc>
@@ -9906,7 +9924,7 @@
           </w:tcPr>
           <w:p>
             <w:r>
-              <w:t xml:space="preserve">DEADBEE</w:t>
+              <w:t>DEADBEE</w:t>
             </w:r>
           </w:p>
         </w:tc>
@@ -9918,7 +9936,7 @@
           </w:tcPr>
           <w:p>
             <w:r>
-              <w:t xml:space="preserve">DRYRUN</w:t>
+              <w:t>DRYRUN</w:t>
             </w:r>
           </w:p>
         </w:tc>
@@ -9928,7 +9946,7 @@
           </w:tcPr>
           <w:p>
             <w:r>
-              <w:t xml:space="preserve">Optional. Prints the current and new BL_CONFIG values and the write method, and does not write flash.</w:t>
+              <w:t>Optional. Prints the current and new BL_CONFIG values and the write method, and does not write flash.</w:t>
             </w:r>
           </w:p>
         </w:tc>
@@ -9938,7 +9956,7 @@
           </w:tcPr>
           <w:p>
             <w:r>
-              <w:t xml:space="preserve">DRYRUN</w:t>
+              <w:t>DRYRUN</w:t>
             </w:r>
           </w:p>
         </w:tc>
@@ -9961,7 +9979,7 @@
         <w:pStyle w:val="code"/>
       </w:pPr>
       <w:r>
-        <w:t xml:space="preserve">AT+BOOTLOADER_PIN?</w:t>
+        <w:t>AT+BOOTLOADER_PIN?</w:t>
       </w:r>
     </w:p>
     <w:p>
@@ -9969,7 +9987,7 @@
         <w:pStyle w:val="code"/>
       </w:pPr>
       <w:r>
-        <w:t xml:space="preserve">BOOTLOADER_PIN=1</w:t>
+        <w:t>BOOTLOADER_PIN=1</w:t>
       </w:r>
     </w:p>
     <w:p>
@@ -9977,7 +9995,7 @@
         <w:pStyle w:val="code"/>
       </w:pPr>
       <w:r>
-        <w:t xml:space="preserve">BL_CONFIG=0xC5FF05C5: ROM bootloader enabled, backdoor enabled on DIO_5 (active high)</w:t>
+        <w:t>BL_CONFIG=0xC5FF05C5: ROM bootloader enabled, backdoor enabled on DIO_5 (active high)</w:t>
       </w:r>
     </w:p>
     <w:p>
@@ -10057,7 +10075,7 @@
         <w:pStyle w:val="code"/>
       </w:pPr>
       <w:r>
-        <w:t xml:space="preserve">CC1314R10 Firmware Build: Release</w:t>
+        <w:t>CC1314R10 Firmware Build: Release</w:t>
       </w:r>
     </w:p>
     <w:p>
@@ -10078,7 +10096,7 @@
     </w:p>
     <w:p>
       <w:r>
-        <w:t xml:space="preserve">The Firmware Build line reads Debug or Release (firmware 0.3.11-rc6 and later). Debug builds add the RF test command AT+TX_CW, which transmits an unmodulated carrier for conducted bench measurements into an attenuator or dummy load. Release builds, including all published releases, don't contain it. To make a Debug build, run ./build.sh -d build_and_flash in firmware/adsbee_1421 (see firmware/README.md).</w:t>
+        <w:t>The Firmware Build line reads Debug or Release (firmware 0.3.11-rc6 and later). Debug builds add the RF test command AT+TX_CW, which transmits an unmodulated carrier for conducted bench measurements into an attenuator or dummy load. Release builds, including all published releases, don't contain it. To make a Debug build, run ./build.sh -d build_and_flash in firmware/adsbee_1421 (see firmware/README.md).</w:t>
       </w:r>
     </w:p>
     <w:p>
@@ -12533,10 +12551,7 @@
     </w:p>
     <w:p>
       <w:r>
-        <w:t>Reports OOK receiver statistics from the LR2021 radio: received packet count (pkt_rx), CRC and length error counts (crc_error, len_error), preamble detector fires (pbl_det), sync word successes and failures (sync_ok, sync_fail), and receive timeouts (timeout). Also reports receiver health counters: LR2021 RX FIFO overflows (fifo_full), raw packet queue overflows (q_ovf), single-bit errors corrected by the decoder (bitflips_fixed), and UAT receiver error restarts (uat_rx_restarts). The counters accumulate un</w:t>
-      </w:r>
-      <w:r>
-        <w:t>til reset.</w:t>
+        <w:t>Reports OOK receiver statistics from the LR2021 radio: received packet count (pkt_rx), CRC and length error counts (crc_error, len_error), preamble detector fires (pbl_det), sync word successes and failures (sync_ok, sync_fail), and receive timeouts (timeout). Also reports receiver health counters: LR2021 RX FIFO overflows (fifo_full), raw packet queue overflows (q_ovf), single-bit errors corrected by the decoder (bitflips_fixed), and UAT receiver error restarts (uat_rx_restarts). The counters accumulate until reset.</w:t>
       </w:r>
     </w:p>
     <w:p>
@@ -12843,10 +12858,7 @@
     </w:p>
     <w:p>
       <w:r>
-        <w:t>Selects the protocol mode of the Sub-GHz receiver. UAT_RX receives 978 MHz UAT ADS-B messages and ground uplink messages (FIS-B / TIS-B). UAT_RX_NO_UPLINK receives UAT ADS-B only: the uplink sync word is disabled at the RF core, so uplink frames are never received or decoded, which reduces receiver airtime and processor load when uplink data is not needed. Defaults to UAT_RX. Additional Sub-GHz protocols may be added as new modes in future firmware. Changes take effect immediately and persist across reboots</w:t>
-      </w:r>
-      <w:r>
-        <w:t xml:space="preserve"> after AT+SETTINGS=SAVE.</w:t>
+        <w:t>Selects the protocol mode of the Sub-GHz receiver. UAT_RX receives 978 MHz UAT ADS-B messages and ground uplink messages (FIS-B / TIS-B). UAT_RX_NO_UPLINK receives UAT ADS-B only: the uplink sync word is disabled at the RF core, so uplink frames are never received or decoded, which reduces receiver airtime and processor load when uplink data is not needed. Defaults to UAT_RX. Additional Sub-GHz protocols may be added as new modes in future firmware. Changes take effect immediately and persist across reboots after AT+SETTINGS=SAVE.</w:t>
       </w:r>
     </w:p>
     <w:p>
@@ -14302,7 +14314,7 @@
               <w:fldChar w:fldCharType="separate"/>
             </w:r>
             <w:r>
-              <w:t>5.1.2.1</w:t>
+              <w:t>4.1.2.1</w:t>
             </w:r>
             <w:r>
               <w:fldChar w:fldCharType="end"/>
@@ -14585,7 +14597,7 @@
               <w:fldChar w:fldCharType="separate"/>
             </w:r>
             <w:r>
-              <w:t>5.1.2.2</w:t>
+              <w:t>4.1.2.2</w:t>
             </w:r>
             <w:r>
               <w:fldChar w:fldCharType="end"/>
@@ -15383,7 +15395,7 @@
               <w:fldChar w:fldCharType="separate"/>
             </w:r>
             <w:r>
-              <w:t>5.1.2.4</w:t>
+              <w:t>4.1.2.4</w:t>
             </w:r>
             <w:r>
               <w:fldChar w:fldCharType="end"/>
@@ -15476,7 +15488,7 @@
               <w:fldChar w:fldCharType="separate"/>
             </w:r>
             <w:r>
-              <w:t>5.1.2.5</w:t>
+              <w:t>4.1.2.5</w:t>
             </w:r>
             <w:r>
               <w:fldChar w:fldCharType="end"/>
@@ -15997,7 +16009,7 @@
               <w:fldChar w:fldCharType="separate"/>
             </w:r>
             <w:r>
-              <w:t>5.1.2.6</w:t>
+              <w:t>4.1.2.6</w:t>
             </w:r>
             <w:r>
               <w:fldChar w:fldCharType="end"/>
@@ -21822,7 +21834,7 @@
               <w:fldChar w:fldCharType="separate"/>
             </w:r>
             <w:r>
-              <w:t>5.1.3.1</w:t>
+              <w:t>4.1.3.1</w:t>
             </w:r>
             <w:r>
               <w:fldChar w:fldCharType="end"/>
@@ -21967,7 +21979,7 @@
               <w:fldChar w:fldCharType="separate"/>
             </w:r>
             <w:r>
-              <w:t>5.1.3.2</w:t>
+              <w:t>4.1.3.2</w:t>
             </w:r>
             <w:r>
               <w:fldChar w:fldCharType="end"/>
@@ -22250,7 +22262,7 @@
               <w:fldChar w:fldCharType="separate"/>
             </w:r>
             <w:r>
-              <w:t>5.1.2.2</w:t>
+              <w:t>4.1.2.2</w:t>
             </w:r>
             <w:r>
               <w:fldChar w:fldCharType="end"/>
@@ -23129,7 +23141,7 @@
               <w:fldChar w:fldCharType="separate"/>
             </w:r>
             <w:r>
-              <w:t>5.1.2.4</w:t>
+              <w:t>4.1.2.4</w:t>
             </w:r>
             <w:r>
               <w:fldChar w:fldCharType="end"/>
@@ -23225,7 +23237,7 @@
               <w:fldChar w:fldCharType="separate"/>
             </w:r>
             <w:r>
-              <w:t>5.1.2.5</w:t>
+              <w:t>4.1.2.5</w:t>
             </w:r>
             <w:r>
               <w:fldChar w:fldCharType="end"/>
@@ -23659,7 +23671,7 @@
               <w:fldChar w:fldCharType="separate"/>
             </w:r>
             <w:r>
-              <w:t>5.1.2.6</w:t>
+              <w:t>4.1.2.6</w:t>
             </w:r>
             <w:r>
               <w:fldChar w:fldCharType="end"/>
@@ -26436,7 +26448,7 @@
               <w:fldChar w:fldCharType="separate"/>
             </w:r>
             <w:r>
-              <w:t>5.1.4.1</w:t>
+              <w:t>4.1.4.1</w:t>
             </w:r>
             <w:r>
               <w:fldChar w:fldCharType="end"/>
@@ -26534,7 +26546,7 @@
         <w:fldChar w:fldCharType="separate"/>
       </w:r>
       <w:r>
-        <w:t>5.1.2.6</w:t>
+        <w:t>4.1.2.6</w:t>
       </w:r>
       <w:r>
         <w:fldChar w:fldCharType="end"/>
@@ -36404,7 +36416,7 @@
         <w:noProof/>
         <w:color w:val="FFFFFF" w:themeColor="background1"/>
       </w:rPr>
-      <w:pict w14:anchorId="31097D8F">
+      <w:pict w14:anchorId="02696CF0">
         <v:rect id="_x0000_s1025" alt="" style="position:absolute;left:0;text-align:left;margin-left:-82.1pt;margin-top:.05pt;width:664.9pt;height:84.5pt;z-index:-251656704;mso-wrap-edited:f;mso-width-percent:0;mso-height-percent:0;mso-width-percent:0;mso-height-percent:0" fillcolor="#00ad4d" stroked="f"/>
       </w:pict>
     </w:r>
@@ -38201,6 +38213,7 @@
   <w:style w:type="character" w:default="1" w:styleId="DefaultParagraphFont">
     <w:name w:val="Default Paragraph Font"/>
     <w:uiPriority w:val="1"/>
+    <w:semiHidden/>
     <w:unhideWhenUsed/>
   </w:style>
   <w:style w:type="table" w:default="1" w:styleId="TableNormal">

</xml_diff>

<commit_message>
Export 1090 and m1421 datasheets (#258)
</commit_message>
<xml_diff>
--- a/word/datasheet_adsbee_m1421.docx
+++ b/word/datasheet_adsbee_m1421.docx
@@ -21,7 +21,7 @@
         <w:rPr>
           <w:noProof/>
         </w:rPr>
-        <w:pict w14:anchorId="085390A5">
+        <w:pict w14:anchorId="374B7A2D">
           <v:shapetype id="_x0000_t202" coordsize="21600,21600" o:spt="202" path="m,l,21600r21600,l21600,xe">
             <v:stroke joinstyle="miter"/>
             <v:path gradientshapeok="t" o:connecttype="rect"/>
@@ -887,7 +887,7 @@
                 <w:noProof/>
                 <w:webHidden/>
               </w:rPr>
-              <w:t>5</w:t>
+              <w:t>4</w:t>
             </w:r>
             <w:r>
               <w:rPr>
@@ -7442,7 +7442,7 @@
     </w:p>
     <w:p>
       <w:r>
-        <w:t>20260818</w:t>
+        <w:t>20260516</w:t>
       </w:r>
     </w:p>
     <w:p>
@@ -7454,7 +7454,7 @@
         </w:numPr>
       </w:pPr>
       <w:r>
-        <w:t>Added AT+SUBG_MODE for selecting the Sub-GHz receiver mode (UAT_RX / UAT_RX_NO_UPLINK, disables UAT uplink reception). AT+RX_ENABLE now powers the Sub-GHz receiver down when disabled.</w:t>
+        <w:t>Initial release.</w:t>
       </w:r>
     </w:p>
     <w:p>
@@ -7471,12 +7471,7 @@
         </w:numPr>
       </w:pPr>
       <w:r>
-        <w:t>Documented the serial command interface and reporting protocols. Renamed the 1090 MHz commands to the R1090_ prefix and added RX_STATS.</w:t>
-      </w:r>
-    </w:p>
-    <w:p>
-      <w:r>
-        <w:t>20260516</w:t>
+        <w:t>Add detailed protocol descriptions.</w:t>
       </w:r>
     </w:p>
     <w:p>
@@ -7488,12 +7483,11 @@
         </w:numPr>
       </w:pPr>
       <w:r>
-        <w:t>Initial release.</w:t>
-      </w:r>
-    </w:p>
-    <w:p>
-      <w:r>
-        <w:t>20260606</w:t>
+        <w:t>Revise power estimate</w:t>
+      </w:r>
+      <w:bookmarkStart w:id="4" w:name="_Toc237911178"/>
+      <w:r>
+        <w:t>.</w:t>
       </w:r>
     </w:p>
     <w:p>
@@ -7505,7 +7499,12 @@
         </w:numPr>
       </w:pPr>
       <w:r>
-        <w:t>Add detailed protocol descriptions.</w:t>
+        <w:t>Documented the serial command interface and reporting protocols. Renamed the 1090 MHz commands to the R1090_ prefix and added RX_STATS.</w:t>
+      </w:r>
+    </w:p>
+    <w:p>
+      <w:r>
+        <w:t>20260818</w:t>
       </w:r>
     </w:p>
     <w:p>
@@ -7517,8 +7516,20 @@
         </w:numPr>
       </w:pPr>
       <w:r>
-        <w:t>Revise power estimate.</w:t>
-      </w:r>
+        <w:t>Added AT+SUBG_MODE for selecting the Sub-GHz receiver mode (UAT_RX / UAT_RX_NO_UPLINK, disables UAT uplink reception). AT+RX_ENABLE now powers the Sub-GHz receiver down when disabled.</w:t>
+      </w:r>
+    </w:p>
+    <w:p/>
+    <w:p>
+      <w:pPr>
+        <w:rPr>
+          <w:rFonts w:ascii="Poppins SemiBold" w:eastAsiaTheme="majorEastAsia" w:hAnsi="Poppins SemiBold" w:cstheme="majorBidi"/>
+          <w:b/>
+          <w:color w:val="00AD4D"/>
+          <w:sz w:val="32"/>
+          <w:szCs w:val="32"/>
+        </w:rPr>
+      </w:pPr>
       <w:r>
         <w:br w:type="page"/>
       </w:r>
@@ -7526,12 +7537,7 @@
     <w:p>
       <w:pPr>
         <w:pStyle w:val="Heading1"/>
-        <w:numPr>
-          <w:ilvl w:val="0"/>
-          <w:numId w:val="4"/>
-        </w:numPr>
       </w:pPr>
-      <w:bookmarkStart w:id="4" w:name="_Toc237911178"/>
       <w:r>
         <w:lastRenderedPageBreak/>
         <w:t>Overview</w:t>
@@ -9119,19 +9125,7 @@
         <w:rPr>
           <w:noProof/>
         </w:rPr>
-        <w:instrText xml:space="preserve"> </w:instrText>
-      </w:r>
-      <w:r>
-        <w:rPr>
-          <w:noProof/>
-        </w:rPr>
-        <w:instrText>INCLUDEPICTURE  "http://10.42.2.218/scrprint.png?reload=0&amp;format=0&amp;mode=0" \* MERGEFORMATINET</w:instrText>
-      </w:r>
-      <w:r>
-        <w:rPr>
-          <w:noProof/>
-        </w:rPr>
-        <w:instrText xml:space="preserve"> </w:instrText>
+        <w:instrText xml:space="preserve"> INCLUDEPICTURE  "http://10.42.2.218/scrprint.png?reload=0&amp;format=0&amp;mode=0" \* MERGEFORMATINET </w:instrText>
       </w:r>
       <w:r>
         <w:rPr>
@@ -9143,7 +9137,25 @@
         <w:rPr>
           <w:noProof/>
         </w:rPr>
-        <w:pict w14:anchorId="66511708">
+        <w:fldChar w:fldCharType="begin"/>
+      </w:r>
+      <w:r>
+        <w:rPr>
+          <w:noProof/>
+        </w:rPr>
+        <w:instrText xml:space="preserve"> INCLUDEPICTURE  "http://10.42.2.218/scrprint.png?reload=0&amp;format=0&amp;mode=0" \* MERGEFORMATINET </w:instrText>
+      </w:r>
+      <w:r>
+        <w:rPr>
+          <w:noProof/>
+        </w:rPr>
+        <w:fldChar w:fldCharType="separate"/>
+      </w:r>
+      <w:r>
+        <w:rPr>
+          <w:noProof/>
+        </w:rPr>
+        <w:pict w14:anchorId="5C05FBD5">
           <v:shapetype id="_x0000_t75" coordsize="21600,21600" o:spt="75" o:preferrelative="t" path="m@4@5l@4@11@9@11@9@5xe" filled="f" stroked="f">
             <v:stroke joinstyle="miter"/>
             <v:formulas>
@@ -9167,6 +9179,12 @@
             <v:imagedata r:id="rId18" r:href="rId19"/>
           </v:shape>
         </w:pict>
+      </w:r>
+      <w:r>
+        <w:rPr>
+          <w:noProof/>
+        </w:rPr>
+        <w:fldChar w:fldCharType="end"/>
       </w:r>
       <w:r>
         <w:rPr>
@@ -9706,7 +9724,7 @@
     </w:p>
     <w:p>
       <w:r>
-        <w:t xml:space="preserve">Enables or disables the bootloader backdoor in the CC1314 CCFG (customer configuration) flash. With the backdoor enabled, which is the factory default, holding SYNC high while ~SRST is pulsed low starts the CC1314 ROM UART bootloader on pins DIO_2/DIO_3. The ADSBee 1421 Programmer and other host tools use this to reflash the module. The setting takes effect at the next reset and persists across power cycles and AT+SETTINGS=RESET. Every write is read back and verified; a write that fails prints a CCFG WRITE FAILED error banner with the read-back value and the recovery steps, and returns ERROR.</w:t>
+        <w:t>Enables or disables the bootloader backdoor in the CC1314 CCFG (customer configuration) flash. With the backdoor enabled, which is the factory default, holding SYNC high while ~SRST is pulsed low starts the CC1314 ROM UART bootloader on pins DIO_2/DIO_3. The ADSBee 1421 Programmer and other host tools use this to reflash the module. The setting takes effect at the next reset and persists across power cycles and AT+SETTINGS=RESET. Every write is read back and verified; a write that fails prints a CCFG WRITE FAILED error banner with the read-back value and the recovery steps, and returns ERROR.</w:t>
       </w:r>
     </w:p>
     <w:p>
@@ -9718,7 +9736,7 @@
         <w:t xml:space="preserve">Warning: </w:t>
       </w:r>
       <w:r>
-        <w:t xml:space="preserve">With the backdoor disabled, SYNC no longer enters the bootloader, so the ADSBee 1421 Programmer and other SYNC-based tools cannot reflash the module. The Programmer (0.3.11-rc4 and later) still bridges the console, without checking the image, so AT+BOOTLOADER_PIN=1,DEADBEE can be sent through it. The only ways to enable it again are AT+BOOTLOADER_PIN=1,DEADBEE sent to the running firmware, or a JTAG flash. Flashing a complete firmware image writes that image's CCFG, which has the backdoor enabled in every release.</w:t>
+        <w:t>With the backdoor disabled, SYNC no longer enters the bootloader, so the ADSBee 1421 Programmer and other SYNC-based tools cannot reflash the module. The Programmer (0.3.11-rc4 and later) still bridges the console, without checking the image, so AT+BOOTLOADER_PIN=1,DEADBEE can be sent through it. The only ways to enable it again are AT+BOOTLOADER_PIN=1,DEADBEE sent to the running firmware, or a JTAG flash. Flashing a complete firmware image writes that image's CCFG, which has the backdoor enabled in every release.</w:t>
       </w:r>
     </w:p>
     <w:p>
@@ -9738,7 +9756,7 @@
         <w:pStyle w:val="code"/>
       </w:pPr>
       <w:r>
-        <w:t xml:space="preserve">AT+BOOTLOADER_PIN=&lt;enabled&gt;,&lt;password&gt;[,DRYRUN]</w:t>
+        <w:t>AT+BOOTLOADER_PIN=&lt;enabled&gt;,&lt;password&gt;[,DRYRUN]</w:t>
       </w:r>
     </w:p>
     <w:p>
@@ -9746,7 +9764,7 @@
         <w:pStyle w:val="code"/>
       </w:pPr>
       <w:r>
-        <w:t xml:space="preserve">BL_CONFIG 0xC5FF0500 -&gt; 0xC5FF05C5: erase and reprogram the CCFG sector</w:t>
+        <w:t>BL_CONFIG 0xC5FF0500 -&gt; 0xC5FF05C5: erase and reprogram the CCFG sector</w:t>
       </w:r>
     </w:p>
     <w:p>
@@ -9754,7 +9772,7 @@
         <w:pStyle w:val="code"/>
       </w:pPr>
       <w:r>
-        <w:t xml:space="preserve">CCFG verified: BL_CONFIG 0xC5FF05C5, CCFG CRC32 0x66E9858D.</w:t>
+        <w:t>CCFG verified: BL_CONFIG 0xC5FF05C5, CCFG CRC32 0x66E9858D.</w:t>
       </w:r>
     </w:p>
     <w:p>
@@ -9762,7 +9780,7 @@
         <w:pStyle w:val="code"/>
       </w:pPr>
       <w:r>
-        <w:t xml:space="preserve">Bootloader backdoor enabled; takes effect at the next reset.</w:t>
+        <w:t>Bootloader backdoor enabled; takes effect at the next reset.</w:t>
       </w:r>
     </w:p>
     <w:p>
@@ -9770,7 +9788,7 @@
         <w:pStyle w:val="code"/>
       </w:pPr>
       <w:r>
-        <w:t xml:space="preserve">OK</w:t>
+        <w:t>OK</w:t>
       </w:r>
     </w:p>
     <w:p/>
@@ -9854,7 +9872,7 @@
           </w:tcPr>
           <w:p>
             <w:r>
-              <w:t xml:space="preserve">enabled</w:t>
+              <w:t>enabled</w:t>
             </w:r>
           </w:p>
         </w:tc>
@@ -9864,7 +9882,7 @@
           </w:tcPr>
           <w:p>
             <w:r>
-              <w:t xml:space="preserve">1: SYNC high while ~SRST is pulsed low starts the ROM UART bootloader. 0: SYNC is ignored at reset.</w:t>
+              <w:t>1: SYNC high while ~SRST is pulsed low starts the ROM UART bootloader. 0: SYNC is ignored at reset.</w:t>
             </w:r>
           </w:p>
         </w:tc>
@@ -9874,7 +9892,7 @@
           </w:tcPr>
           <w:p>
             <w:r>
-              <w:t xml:space="preserve">0, 1</w:t>
+              <w:t>0, 1</w:t>
             </w:r>
           </w:p>
         </w:tc>
@@ -9886,7 +9904,7 @@
           </w:tcPr>
           <w:p>
             <w:r>
-              <w:t xml:space="preserve">password</w:t>
+              <w:t>password</w:t>
             </w:r>
           </w:p>
         </w:tc>
@@ -9896,7 +9914,7 @@
           </w:tcPr>
           <w:p>
             <w:r>
-              <w:t xml:space="preserve">Required for every set form, DRYRUN included, so the CCFG is only written on purpose. A missing or wrong password returns ERROR and leaves the CCFG untouched. Queries need no password.</w:t>
+              <w:t>Required for every set form, DRYRUN included, so the CCFG is only written on purpose. A missing or wrong password returns ERROR and leaves the CCFG untouched. Queries need no password.</w:t>
             </w:r>
           </w:p>
         </w:tc>
@@ -9906,7 +9924,7 @@
           </w:tcPr>
           <w:p>
             <w:r>
-              <w:t xml:space="preserve">DEADBEE</w:t>
+              <w:t>DEADBEE</w:t>
             </w:r>
           </w:p>
         </w:tc>
@@ -9918,7 +9936,7 @@
           </w:tcPr>
           <w:p>
             <w:r>
-              <w:t xml:space="preserve">DRYRUN</w:t>
+              <w:t>DRYRUN</w:t>
             </w:r>
           </w:p>
         </w:tc>
@@ -9928,7 +9946,7 @@
           </w:tcPr>
           <w:p>
             <w:r>
-              <w:t xml:space="preserve">Optional. Prints the current and new BL_CONFIG values and the write method, and does not write flash.</w:t>
+              <w:t>Optional. Prints the current and new BL_CONFIG values and the write method, and does not write flash.</w:t>
             </w:r>
           </w:p>
         </w:tc>
@@ -9938,7 +9956,7 @@
           </w:tcPr>
           <w:p>
             <w:r>
-              <w:t xml:space="preserve">DRYRUN</w:t>
+              <w:t>DRYRUN</w:t>
             </w:r>
           </w:p>
         </w:tc>
@@ -9961,7 +9979,7 @@
         <w:pStyle w:val="code"/>
       </w:pPr>
       <w:r>
-        <w:t xml:space="preserve">AT+BOOTLOADER_PIN?</w:t>
+        <w:t>AT+BOOTLOADER_PIN?</w:t>
       </w:r>
     </w:p>
     <w:p>
@@ -9969,7 +9987,7 @@
         <w:pStyle w:val="code"/>
       </w:pPr>
       <w:r>
-        <w:t xml:space="preserve">BOOTLOADER_PIN=1</w:t>
+        <w:t>BOOTLOADER_PIN=1</w:t>
       </w:r>
     </w:p>
     <w:p>
@@ -9977,7 +9995,7 @@
         <w:pStyle w:val="code"/>
       </w:pPr>
       <w:r>
-        <w:t xml:space="preserve">BL_CONFIG=0xC5FF05C5: ROM bootloader enabled, backdoor enabled on DIO_5 (active high)</w:t>
+        <w:t>BL_CONFIG=0xC5FF05C5: ROM bootloader enabled, backdoor enabled on DIO_5 (active high)</w:t>
       </w:r>
     </w:p>
     <w:p>
@@ -10057,7 +10075,7 @@
         <w:pStyle w:val="code"/>
       </w:pPr>
       <w:r>
-        <w:t xml:space="preserve">CC1314R10 Firmware Build: Release</w:t>
+        <w:t>CC1314R10 Firmware Build: Release</w:t>
       </w:r>
     </w:p>
     <w:p>
@@ -10078,7 +10096,7 @@
     </w:p>
     <w:p>
       <w:r>
-        <w:t xml:space="preserve">The Firmware Build line reads Debug or Release (firmware 0.3.11-rc6 and later). Debug builds add the RF test command AT+TX_CW, which transmits an unmodulated carrier for conducted bench measurements into an attenuator or dummy load. Release builds, including all published releases, don't contain it. To make a Debug build, run ./build.sh -d build_and_flash in firmware/adsbee_1421 (see firmware/README.md).</w:t>
+        <w:t>The Firmware Build line reads Debug or Release (firmware 0.3.11-rc6 and later). Debug builds add the RF test command AT+TX_CW, which transmits an unmodulated carrier for conducted bench measurements into an attenuator or dummy load. Release builds, including all published releases, don't contain it. To make a Debug build, run ./build.sh -d build_and_flash in firmware/adsbee_1421 (see firmware/README.md).</w:t>
       </w:r>
     </w:p>
     <w:p>
@@ -12533,10 +12551,7 @@
     </w:p>
     <w:p>
       <w:r>
-        <w:t>Reports OOK receiver statistics from the LR2021 radio: received packet count (pkt_rx), CRC and length error counts (crc_error, len_error), preamble detector fires (pbl_det), sync word successes and failures (sync_ok, sync_fail), and receive timeouts (timeout). Also reports receiver health counters: LR2021 RX FIFO overflows (fifo_full), raw packet queue overflows (q_ovf), single-bit errors corrected by the decoder (bitflips_fixed), and UAT receiver error restarts (uat_rx_restarts). The counters accumulate un</w:t>
-      </w:r>
-      <w:r>
-        <w:t>til reset.</w:t>
+        <w:t>Reports OOK receiver statistics from the LR2021 radio: received packet count (pkt_rx), CRC and length error counts (crc_error, len_error), preamble detector fires (pbl_det), sync word successes and failures (sync_ok, sync_fail), and receive timeouts (timeout). Also reports receiver health counters: LR2021 RX FIFO overflows (fifo_full), raw packet queue overflows (q_ovf), single-bit errors corrected by the decoder (bitflips_fixed), and UAT receiver error restarts (uat_rx_restarts). The counters accumulate until reset.</w:t>
       </w:r>
     </w:p>
     <w:p>
@@ -12843,10 +12858,7 @@
     </w:p>
     <w:p>
       <w:r>
-        <w:t>Selects the protocol mode of the Sub-GHz receiver. UAT_RX receives 978 MHz UAT ADS-B messages and ground uplink messages (FIS-B / TIS-B). UAT_RX_NO_UPLINK receives UAT ADS-B only: the uplink sync word is disabled at the RF core, so uplink frames are never received or decoded, which reduces receiver airtime and processor load when uplink data is not needed. Defaults to UAT_RX. Additional Sub-GHz protocols may be added as new modes in future firmware. Changes take effect immediately and persist across reboots</w:t>
-      </w:r>
-      <w:r>
-        <w:t xml:space="preserve"> after AT+SETTINGS=SAVE.</w:t>
+        <w:t>Selects the protocol mode of the Sub-GHz receiver. UAT_RX receives 978 MHz UAT ADS-B messages and ground uplink messages (FIS-B / TIS-B). UAT_RX_NO_UPLINK receives UAT ADS-B only: the uplink sync word is disabled at the RF core, so uplink frames are never received or decoded, which reduces receiver airtime and processor load when uplink data is not needed. Defaults to UAT_RX. Additional Sub-GHz protocols may be added as new modes in future firmware. Changes take effect immediately and persist across reboots after AT+SETTINGS=SAVE.</w:t>
       </w:r>
     </w:p>
     <w:p>
@@ -14302,7 +14314,7 @@
               <w:fldChar w:fldCharType="separate"/>
             </w:r>
             <w:r>
-              <w:t>5.1.2.1</w:t>
+              <w:t>4.1.2.1</w:t>
             </w:r>
             <w:r>
               <w:fldChar w:fldCharType="end"/>
@@ -14585,7 +14597,7 @@
               <w:fldChar w:fldCharType="separate"/>
             </w:r>
             <w:r>
-              <w:t>5.1.2.2</w:t>
+              <w:t>4.1.2.2</w:t>
             </w:r>
             <w:r>
               <w:fldChar w:fldCharType="end"/>
@@ -15383,7 +15395,7 @@
               <w:fldChar w:fldCharType="separate"/>
             </w:r>
             <w:r>
-              <w:t>5.1.2.4</w:t>
+              <w:t>4.1.2.4</w:t>
             </w:r>
             <w:r>
               <w:fldChar w:fldCharType="end"/>
@@ -15476,7 +15488,7 @@
               <w:fldChar w:fldCharType="separate"/>
             </w:r>
             <w:r>
-              <w:t>5.1.2.5</w:t>
+              <w:t>4.1.2.5</w:t>
             </w:r>
             <w:r>
               <w:fldChar w:fldCharType="end"/>
@@ -15997,7 +16009,7 @@
               <w:fldChar w:fldCharType="separate"/>
             </w:r>
             <w:r>
-              <w:t>5.1.2.6</w:t>
+              <w:t>4.1.2.6</w:t>
             </w:r>
             <w:r>
               <w:fldChar w:fldCharType="end"/>
@@ -21822,7 +21834,7 @@
               <w:fldChar w:fldCharType="separate"/>
             </w:r>
             <w:r>
-              <w:t>5.1.3.1</w:t>
+              <w:t>4.1.3.1</w:t>
             </w:r>
             <w:r>
               <w:fldChar w:fldCharType="end"/>
@@ -21967,7 +21979,7 @@
               <w:fldChar w:fldCharType="separate"/>
             </w:r>
             <w:r>
-              <w:t>5.1.3.2</w:t>
+              <w:t>4.1.3.2</w:t>
             </w:r>
             <w:r>
               <w:fldChar w:fldCharType="end"/>
@@ -22250,7 +22262,7 @@
               <w:fldChar w:fldCharType="separate"/>
             </w:r>
             <w:r>
-              <w:t>5.1.2.2</w:t>
+              <w:t>4.1.2.2</w:t>
             </w:r>
             <w:r>
               <w:fldChar w:fldCharType="end"/>
@@ -23129,7 +23141,7 @@
               <w:fldChar w:fldCharType="separate"/>
             </w:r>
             <w:r>
-              <w:t>5.1.2.4</w:t>
+              <w:t>4.1.2.4</w:t>
             </w:r>
             <w:r>
               <w:fldChar w:fldCharType="end"/>
@@ -23225,7 +23237,7 @@
               <w:fldChar w:fldCharType="separate"/>
             </w:r>
             <w:r>
-              <w:t>5.1.2.5</w:t>
+              <w:t>4.1.2.5</w:t>
             </w:r>
             <w:r>
               <w:fldChar w:fldCharType="end"/>
@@ -23659,7 +23671,7 @@
               <w:fldChar w:fldCharType="separate"/>
             </w:r>
             <w:r>
-              <w:t>5.1.2.6</w:t>
+              <w:t>4.1.2.6</w:t>
             </w:r>
             <w:r>
               <w:fldChar w:fldCharType="end"/>
@@ -26436,7 +26448,7 @@
               <w:fldChar w:fldCharType="separate"/>
             </w:r>
             <w:r>
-              <w:t>5.1.4.1</w:t>
+              <w:t>4.1.4.1</w:t>
             </w:r>
             <w:r>
               <w:fldChar w:fldCharType="end"/>
@@ -26534,7 +26546,7 @@
         <w:fldChar w:fldCharType="separate"/>
       </w:r>
       <w:r>
-        <w:t>5.1.2.6</w:t>
+        <w:t>4.1.2.6</w:t>
       </w:r>
       <w:r>
         <w:fldChar w:fldCharType="end"/>
@@ -36404,7 +36416,7 @@
         <w:noProof/>
         <w:color w:val="FFFFFF" w:themeColor="background1"/>
       </w:rPr>
-      <w:pict w14:anchorId="31097D8F">
+      <w:pict w14:anchorId="02696CF0">
         <v:rect id="_x0000_s1025" alt="" style="position:absolute;left:0;text-align:left;margin-left:-82.1pt;margin-top:.05pt;width:664.9pt;height:84.5pt;z-index:-251656704;mso-wrap-edited:f;mso-width-percent:0;mso-height-percent:0;mso-width-percent:0;mso-height-percent:0" fillcolor="#00ad4d" stroked="f"/>
       </w:pict>
     </w:r>
@@ -38201,6 +38213,7 @@
   <w:style w:type="character" w:default="1" w:styleId="DefaultParagraphFont">
     <w:name w:val="Default Paragraph Font"/>
     <w:uiPriority w:val="1"/>
+    <w:semiHidden/>
     <w:unhideWhenUsed/>
   </w:style>
   <w:style w:type="table" w:default="1" w:styleId="TableNormal">

</xml_diff>

<commit_message>
m1421 datasheet: MODE_S and DF17 receiver modes, R1090_GAIN AUTO per mode
</commit_message>
<xml_diff>
--- a/word/datasheet_adsbee_m1421.docx
+++ b/word/datasheet_adsbee_m1421.docx
@@ -7519,6 +7519,23 @@
         <w:t>Added AT+SUBG_MODE for selecting the Sub-GHz receiver mode (UAT_RX / UAT_RX_NO_UPLINK, disables UAT uplink reception). AT+RX_ENABLE now powers the Sub-GHz receiver down when disabled.</w:t>
       </w:r>
     </w:p>
+    <w:p>
+      <w:r>
+        <w:t>20261006</w:t>
+      </w:r>
+    </w:p>
+    <w:p>
+      <w:pPr>
+        <w:pStyle w:val="ListParagraph"/>
+        <w:numPr>
+          <w:ilvl w:val="0"/>
+          <w:numId w:val="5"/>
+        </w:numPr>
+      </w:pPr>
+      <w:r>
+        <w:t>AT+R1090_PREAMBLE now has two modes: MODE_S (new default, every downlink format) and DF17 (DF17 frames only). MODE_S_PREAMBLE and MODE_S_SW_CRC were removed. AT+R1090_GAIN AUTO is automatic gain control in DF17 and gain step 13 in MODE_S.</w:t>
+      </w:r>
+    </w:p>
     <w:p/>
     <w:p>
       <w:pPr>
@@ -10805,10 +10822,10 @@
     </w:p>
     <w:p>
       <w:r>
-        <w:t xml:space="preserve">Sets the gain of the 1090 MHz front-end. Lower gain steps reduce sensitivity but improve dynamic range in high-signal environments. </w:t>
-      </w:r>
-      <w:r>
-        <w:t xml:space="preserve">AUTO enables automatic gain control, which improves dynamic range at the cost of mangling the preamble. For best dynamic range, utilize AUTO gain with DF17 preamble. </w:t>
+        <w:t xml:space="preserve">Sets the gain of the 1090 MHz front-end. </w:t>
+      </w:r>
+      <w:r>
+        <w:t xml:space="preserve">AUTO uses the gain that suits the receiver mode: automatic gain control in DF17 mode, fixed gain step 13 in MODE_S mode. A manual step of 1-15 sets a fixed gain in either mode; lower steps reduce sensitivity. </w:t>
       </w:r>
       <w:r>
         <w:t xml:space="preserve">Defaults to </w:t>
@@ -10938,7 +10955,7 @@
           </w:tcPr>
           <w:p>
             <w:r>
-              <w:t>1090 MHz front-end AGC gain step.</w:t>
+              <w:t>1090 MHz front-end gain step.</w:t>
             </w:r>
           </w:p>
         </w:tc>
@@ -10954,7 +10971,7 @@
               <w:t xml:space="preserve"> or AUTO</w:t>
             </w:r>
             <w:r>
-              <w:t xml:space="preserve"> = automatic; 1-15 = manual (13 = maximum gain)</w:t>
+              <w:t xml:space="preserve"> = mode default (AGC in DF17, step 13 in MODE_S); 1-15 = manual (13 = maximum gain)</w:t>
             </w:r>
           </w:p>
         </w:tc>
@@ -11023,13 +11040,13 @@
     </w:p>
     <w:p>
       <w:r>
-        <w:t xml:space="preserve">Sets the preamble detection mode used by the 1090 MHz Mode S receiver. The DF17 mode triggers on the second preamble half plus the DF17 header bits, which </w:t>
-      </w:r>
-      <w:r>
-        <w:t xml:space="preserve">provides best dynamic range. This comes at the cost of missing non-DF17 messages, including DF 4/5/11 (no squawk codes, pressure altitude from ADSB only, no all-call reply). For aircraft detection and collision avoidance purposes, DF17 preamble mode is recommended. Defaults to DF17. </w:t>
-      </w:r>
-      <w:r>
-        <w:t>The MODE_S_SW_CRC mode uses the standard Mode S preamble with the hardware CRC filter disabled; the firmware validates the CRC in software, keeping failed-CRC frames available for error correction.</w:t>
+        <w:t xml:space="preserve">Sets the 1090 MHz Mode S receiver mode. MODE_S detects the whole 16-chip preamble at a fixed gain and receives every downlink format, including DF 4/5/11/20/21 (squawk codes, pressure altitude, all-call replies), from weak signals up to strong nearby transmitters. </w:t>
+      </w:r>
+      <w:r>
+        <w:t xml:space="preserve">DF17 triggers on the second preamble half plus the DF17 header bits and receives DF17 (ADS-B) frames only. Defaults to MODE_S. </w:t>
+      </w:r>
+      <w:r>
+        <w:t>Settings saved by earlier firmware with a mode that no longer exists load as MODE_S.</w:t>
       </w:r>
     </w:p>
     <w:p>
@@ -11153,7 +11170,7 @@
           </w:tcPr>
           <w:p>
             <w:r>
-              <w:t>1090 MHz Mode S receiver preamble detection mode.</w:t>
+              <w:t>1090 MHz Mode S receiver mode.</w:t>
             </w:r>
           </w:p>
         </w:tc>
@@ -11163,7 +11180,7 @@
           </w:tcPr>
           <w:p>
             <w:r>
-              <w:t>MODE_S_PREAMBLE, DF17, MODE_S_SW_CRC</w:t>
+              <w:t>MODE_S, DF17</w:t>
             </w:r>
           </w:p>
         </w:tc>
@@ -11196,7 +11213,7 @@
         <w:pStyle w:val="code"/>
       </w:pPr>
       <w:r>
-        <w:t>R1090_PREAMBLE=MODE_S_PREAMBLE</w:t>
+        <w:t>R1090_PREAMBLE=MODE_S</w:t>
       </w:r>
     </w:p>
     <w:p/>
@@ -36601,13 +36618,13 @@
       <w:rPr>
         <w:color w:val="FFFFFF" w:themeColor="background1"/>
       </w:rPr>
-      <w:t>20260</w:t>
+      <w:t>20261</w:t>
     </w:r>
     <w:r>
       <w:rPr>
         <w:color w:val="FFFFFF" w:themeColor="background1"/>
       </w:rPr>
-      <w:t>818</w:t>
+      <w:t>006</w:t>
     </w:r>
     <w:r>
       <w:rPr>

</xml_diff>

<commit_message>
1421: settings version 5, R1090PreambleMode MODE_S = 0, DF17 = 1; drop the stored-value mapping of removed modes
Saved settings from earlier firmware reset to factory defaults on upgrade.
</commit_message>
<xml_diff>
--- a/word/datasheet_adsbee_m1421.docx
+++ b/word/datasheet_adsbee_m1421.docx
@@ -7533,7 +7533,7 @@
         </w:numPr>
       </w:pPr>
       <w:r>
-        <w:t>AT+R1090_PREAMBLE now has two modes: MODE_S (new default, every downlink format) and DF17 (DF17 frames only). MODE_S_PREAMBLE and MODE_S_SW_CRC were removed. AT+R1090_GAIN AUTO is automatic gain control in DF17 and gain step 13 in MODE_S.</w:t>
+        <w:t>AT+R1090_PREAMBLE now has two modes: MODE_S (new default, every downlink format) and DF17 (DF17 frames only). AT+R1090_GAIN AUTO is automatic gain control in DF17 and gain step 13 in MODE_S. Saved settings reset to factory defaults when upgrading to this firmware.</w:t>
       </w:r>
     </w:p>
     <w:p/>
@@ -11043,10 +11043,7 @@
         <w:t xml:space="preserve">Sets the 1090 MHz Mode S receiver mode. MODE_S detects the whole 16-chip preamble at a fixed gain and receives every downlink format, including DF 4/5/11/20/21 (squawk codes, pressure altitude, all-call replies), from weak signals up to strong nearby transmitters. </w:t>
       </w:r>
       <w:r>
-        <w:t xml:space="preserve">DF17 triggers on the second preamble half plus the DF17 header bits and receives DF17 (ADS-B) frames only. Defaults to MODE_S. </w:t>
-      </w:r>
-      <w:r>
-        <w:t>Settings saved by earlier firmware with a mode that no longer exists load as MODE_S.</w:t>
+        <w:t>DF17 triggers on the second preamble half plus the DF17 header bits and receives DF17 (ADS-B) frames only. Defaults to MODE_S.</w:t>
       </w:r>
     </w:p>
     <w:p>

</xml_diff>

<commit_message>
1421: two receiver modes, MODE_S (default) and DF17 (#266)
* 1421: two receiver modes, MODE_S (fixed gain 13, no saturation blanking, default) and DF17

MODE_S runs the whole-preamble detector at fixed gain step 13 with the front-end
saturation blanking off (0xF30150[7:0] = 0x18). MODE_S_STRONG and the AGC-trigger
MODE_S config are removed. Stored values of removed modes load as MODE_S; a stored
DF17 stays DF17. No settings version change.

* m1421 datasheet: MODE_S and DF17 receiver modes, R1090_GAIN AUTO per mode

* m1421 datasheet: footer firmware version 0.3.10

* 1421: settings version 5, R1090PreambleMode MODE_S = 0, DF17 = 1; drop the stored-value mapping of removed modes

Saved settings from earlier firmware reset to factory defaults on upgrade.
</commit_message>
<xml_diff>
--- a/word/datasheet_adsbee_m1421.docx
+++ b/word/datasheet_adsbee_m1421.docx
@@ -7519,6 +7519,23 @@
         <w:t>Added AT+SUBG_MODE for selecting the Sub-GHz receiver mode (UAT_RX / UAT_RX_NO_UPLINK, disables UAT uplink reception). AT+RX_ENABLE now powers the Sub-GHz receiver down when disabled.</w:t>
       </w:r>
     </w:p>
+    <w:p>
+      <w:r>
+        <w:t>20261006</w:t>
+      </w:r>
+    </w:p>
+    <w:p>
+      <w:pPr>
+        <w:pStyle w:val="ListParagraph"/>
+        <w:numPr>
+          <w:ilvl w:val="0"/>
+          <w:numId w:val="5"/>
+        </w:numPr>
+      </w:pPr>
+      <w:r>
+        <w:t>AT+R1090_PREAMBLE now has two modes: MODE_S (new default, every downlink format) and DF17 (DF17 frames only). AT+R1090_GAIN AUTO is automatic gain control in DF17 and gain step 13 in MODE_S. Saved settings reset to factory defaults when upgrading to this firmware.</w:t>
+      </w:r>
+    </w:p>
     <w:p/>
     <w:p>
       <w:pPr>
@@ -10805,10 +10822,10 @@
     </w:p>
     <w:p>
       <w:r>
-        <w:t xml:space="preserve">Sets the gain of the 1090 MHz front-end. Lower gain steps reduce sensitivity but improve dynamic range in high-signal environments. </w:t>
-      </w:r>
-      <w:r>
-        <w:t xml:space="preserve">AUTO enables automatic gain control, which improves dynamic range at the cost of mangling the preamble. For best dynamic range, utilize AUTO gain with DF17 preamble. </w:t>
+        <w:t xml:space="preserve">Sets the gain of the 1090 MHz front-end. </w:t>
+      </w:r>
+      <w:r>
+        <w:t xml:space="preserve">AUTO uses the gain that suits the receiver mode: automatic gain control in DF17 mode, fixed gain step 13 in MODE_S mode. A manual step of 1-15 sets a fixed gain in either mode; lower steps reduce sensitivity. </w:t>
       </w:r>
       <w:r>
         <w:t xml:space="preserve">Defaults to </w:t>
@@ -10938,7 +10955,7 @@
           </w:tcPr>
           <w:p>
             <w:r>
-              <w:t>1090 MHz front-end AGC gain step.</w:t>
+              <w:t>1090 MHz front-end gain step.</w:t>
             </w:r>
           </w:p>
         </w:tc>
@@ -10954,7 +10971,7 @@
               <w:t xml:space="preserve"> or AUTO</w:t>
             </w:r>
             <w:r>
-              <w:t xml:space="preserve"> = automatic; 1-15 = manual (13 = maximum gain)</w:t>
+              <w:t xml:space="preserve"> = mode default (AGC in DF17, step 13 in MODE_S); 1-15 = manual (13 = maximum gain)</w:t>
             </w:r>
           </w:p>
         </w:tc>
@@ -11023,13 +11040,10 @@
     </w:p>
     <w:p>
       <w:r>
-        <w:t xml:space="preserve">Sets the preamble detection mode used by the 1090 MHz Mode S receiver. The DF17 mode triggers on the second preamble half plus the DF17 header bits, which </w:t>
-      </w:r>
-      <w:r>
-        <w:t xml:space="preserve">provides best dynamic range. This comes at the cost of missing non-DF17 messages, including DF 4/5/11 (no squawk codes, pressure altitude from ADSB only, no all-call reply). For aircraft detection and collision avoidance purposes, DF17 preamble mode is recommended. Defaults to DF17. </w:t>
-      </w:r>
-      <w:r>
-        <w:t>The MODE_S_SW_CRC mode uses the standard Mode S preamble with the hardware CRC filter disabled; the firmware validates the CRC in software, keeping failed-CRC frames available for error correction.</w:t>
+        <w:t xml:space="preserve">Sets the 1090 MHz Mode S receiver mode. MODE_S detects the whole 16-chip preamble at a fixed gain and receives every downlink format, including DF 4/5/11/20/21 (squawk codes, pressure altitude, all-call replies), from weak signals up to strong nearby transmitters. </w:t>
+      </w:r>
+      <w:r>
+        <w:t>DF17 triggers on the second preamble half plus the DF17 header bits and receives DF17 (ADS-B) frames only. Defaults to MODE_S.</w:t>
       </w:r>
     </w:p>
     <w:p>
@@ -11153,7 +11167,7 @@
           </w:tcPr>
           <w:p>
             <w:r>
-              <w:t>1090 MHz Mode S receiver preamble detection mode.</w:t>
+              <w:t>1090 MHz Mode S receiver mode.</w:t>
             </w:r>
           </w:p>
         </w:tc>
@@ -11163,7 +11177,7 @@
           </w:tcPr>
           <w:p>
             <w:r>
-              <w:t>MODE_S_PREAMBLE, DF17, MODE_S_SW_CRC</w:t>
+              <w:t>MODE_S, DF17</w:t>
             </w:r>
           </w:p>
         </w:tc>
@@ -11196,7 +11210,7 @@
         <w:pStyle w:val="code"/>
       </w:pPr>
       <w:r>
-        <w:t>R1090_PREAMBLE=MODE_S_PREAMBLE</w:t>
+        <w:t>R1090_PREAMBLE=MODE_S</w:t>
       </w:r>
     </w:p>
     <w:p/>
@@ -36601,13 +36615,13 @@
       <w:rPr>
         <w:color w:val="FFFFFF" w:themeColor="background1"/>
       </w:rPr>
-      <w:t>20260</w:t>
+      <w:t>20261</w:t>
     </w:r>
     <w:r>
       <w:rPr>
         <w:color w:val="FFFFFF" w:themeColor="background1"/>
       </w:rPr>
-      <w:t>818</w:t>
+      <w:t>006</w:t>
     </w:r>
     <w:r>
       <w:rPr>
@@ -36626,7 +36640,7 @@
       <w:rPr>
         <w:color w:val="FFFFFF" w:themeColor="background1"/>
       </w:rPr>
-      <w:t>8</w:t>
+      <w:t>10</w:t>
     </w:r>
   </w:p>
 </w:ftr>

</xml_diff>

<commit_message>
m1421 datasheet: AT+SETTINGS?DUMP example matches firmware output
Lines start with AT+, include AT+R1090_PREAMBLE=MODE_S, and AT+RX_ENABLE has the
empty leading argument the dump writes.
</commit_message>
<xml_diff>
--- a/word/datasheet_adsbee_m1421.docx
+++ b/word/datasheet_adsbee_m1421.docx
@@ -12699,7 +12699,7 @@
         <w:pStyle w:val="code"/>
       </w:pPr>
       <w:r>
-        <w:t>+PROTOCOL_OUT=CONSOLE,MAVLINK2</w:t>
+        <w:t>AT+PROTOCOL_OUT=CONSOLE,MAVLINK2</w:t>
       </w:r>
     </w:p>
     <w:p>
@@ -12707,7 +12707,7 @@
         <w:pStyle w:val="code"/>
       </w:pPr>
       <w:r>
-        <w:t>+R1090_GAIN=10</w:t>
+        <w:t>AT+R1090_GAIN=10</w:t>
       </w:r>
     </w:p>
     <w:p>
@@ -12715,7 +12715,7 @@
         <w:pStyle w:val="code"/>
       </w:pPr>
       <w:r>
-        <w:t>+RX_ENABLE=1,1,1</w:t>
+        <w:t>AT+R1090_PREAMBLE=MODE_S</w:t>
       </w:r>
     </w:p>
     <w:p>
@@ -12723,7 +12723,7 @@
         <w:pStyle w:val="code"/>
       </w:pPr>
       <w:r>
-        <w:t>+SUBG_MODE=UAT_RX</w:t>
+        <w:t>AT+RX_ENABLE=,1,1</w:t>
       </w:r>
     </w:p>
     <w:p>
@@ -12731,7 +12731,7 @@
         <w:pStyle w:val="code"/>
       </w:pPr>
       <w:r>
-        <w:t>+WATCHDOG=0</w:t>
+        <w:t>AT+SUBG_MODE=UAT_RX</w:t>
       </w:r>
     </w:p>
     <w:p>

</xml_diff>

<commit_message>
m1421: firmware 0.3.11 in the datasheet, TOC matches the headings, Mode S dynamic range -90 to 0 dBm
- datasheet footer Firmware Version 0.3.11; features cited as 0.3.11-rc4/rc6 now say 0.3.11
- TOC rebuilt from the headings: AT Commands is section 3, Overview is unnumbered,
  adds 3.2.1/3.2.2 (AT+BOOTLOADER_PIN), page numbers match the exported PDF
- Mode S dynamic range -90 to 0 dBm in the datasheet Quick Specs, docs/adsbee-1421/m1421.md,
  the AT+R1090_PREAMBLE help string and the 1421 web console
</commit_message>
<xml_diff>
--- a/word/datasheet_adsbee_m1421.docx
+++ b/word/datasheet_adsbee_m1421.docx
@@ -380,7 +380,7 @@
           </w:tcPr>
           <w:p>
             <w:r>
-              <w:t>Mode S: 90dBm</w:t>
+              <w:t>Mode S: -90 to 0 dBm</w:t>
             </w:r>
           </w:p>
           <w:p>
@@ -812,7 +812,6 @@
           <w:pPr>
             <w:pStyle w:val="TOC1"/>
             <w:tabs>
-              <w:tab w:val="left" w:pos="440"/>
               <w:tab w:val="right" w:leader="dot" w:pos="10790"/>
             </w:tabs>
             <w:rPr>
@@ -829,34 +828,17 @@
                 <w:rStyle w:val="Hyperlink"/>
                 <w:noProof/>
               </w:rPr>
-              <w:t>1</w:t>
-            </w:r>
-            <w:r>
-              <w:rPr>
-                <w:rFonts w:eastAsiaTheme="minorEastAsia"/>
-                <w:noProof/>
-                <w:sz w:val="24"/>
-                <w:szCs w:val="24"/>
-                <w:lang w:eastAsia="zh-CN"/>
+              <w:t>Overview</w:t>
+            </w:r>
+            <w:r>
+              <w:rPr>
+                <w:noProof/>
+                <w:webHidden/>
               </w:rPr>
               <w:tab/>
             </w:r>
             <w:r>
               <w:rPr>
-                <w:rStyle w:val="Hyperlink"/>
-                <w:noProof/>
-              </w:rPr>
-              <w:t>Overview</w:t>
-            </w:r>
-            <w:r>
-              <w:rPr>
-                <w:noProof/>
-                <w:webHidden/>
-              </w:rPr>
-              <w:tab/>
-            </w:r>
-            <w:r>
-              <w:rPr>
                 <w:noProof/>
                 <w:webHidden/>
               </w:rPr>
@@ -887,7 +869,7 @@
                 <w:noProof/>
                 <w:webHidden/>
               </w:rPr>
-              <w:t>4</w:t>
+              <w:t>5</w:t>
             </w:r>
             <w:r>
               <w:rPr>
@@ -919,7 +901,7 @@
                 <w:rStyle w:val="Hyperlink"/>
                 <w:noProof/>
               </w:rPr>
-              <w:t>2</w:t>
+              <w:t>1</w:t>
             </w:r>
             <w:r>
               <w:rPr>
@@ -1009,7 +991,7 @@
                 <w:rStyle w:val="Hyperlink"/>
                 <w:noProof/>
               </w:rPr>
-              <w:t>2.1</w:t>
+              <w:t>1.1</w:t>
             </w:r>
             <w:r>
               <w:rPr>
@@ -1099,7 +1081,7 @@
                 <w:rStyle w:val="Hyperlink"/>
                 <w:noProof/>
               </w:rPr>
-              <w:t>3</w:t>
+              <w:t>2</w:t>
             </w:r>
             <w:r>
               <w:rPr>
@@ -1189,7 +1171,7 @@
                 <w:rStyle w:val="Hyperlink"/>
                 <w:noProof/>
               </w:rPr>
-              <w:t>3.1</w:t>
+              <w:t>2.1</w:t>
             </w:r>
             <w:r>
               <w:rPr>
@@ -1279,7 +1261,7 @@
                 <w:rStyle w:val="Hyperlink"/>
                 <w:noProof/>
               </w:rPr>
-              <w:t>3.2</w:t>
+              <w:t>2.2</w:t>
             </w:r>
             <w:r>
               <w:rPr>
@@ -1369,7 +1351,7 @@
                 <w:rStyle w:val="Hyperlink"/>
                 <w:noProof/>
               </w:rPr>
-              <w:t>4</w:t>
+              <w:t>3</w:t>
             </w:r>
             <w:r>
               <w:rPr>
@@ -1459,7 +1441,7 @@
                 <w:rStyle w:val="Hyperlink"/>
                 <w:noProof/>
               </w:rPr>
-              <w:t>4.1</w:t>
+              <w:t>3.1</w:t>
             </w:r>
             <w:r>
               <w:rPr>
@@ -1549,7 +1531,7 @@
                 <w:rStyle w:val="Hyperlink"/>
                 <w:noProof/>
               </w:rPr>
-              <w:t>4.1.1</w:t>
+              <w:t>3.1.1</w:t>
             </w:r>
             <w:r>
               <w:rPr>
@@ -1639,7 +1621,7 @@
                 <w:rStyle w:val="Hyperlink"/>
                 <w:noProof/>
               </w:rPr>
-              <w:t>4.1.2</w:t>
+              <w:t>3.1.2</w:t>
             </w:r>
             <w:r>
               <w:rPr>
@@ -1729,7 +1711,7 @@
                 <w:rStyle w:val="Hyperlink"/>
                 <w:noProof/>
               </w:rPr>
-              <w:t>4.2</w:t>
+              <w:t>3.2</w:t>
             </w:r>
             <w:r>
               <w:rPr>
@@ -1768,6 +1750,186 @@
                 <w:webHidden/>
               </w:rPr>
               <w:instrText xml:space="preserve"> PAGEREF _Toc237911188 \h </w:instrText>
+            </w:r>
+            <w:r>
+              <w:rPr>
+                <w:noProof/>
+                <w:webHidden/>
+              </w:rPr>
+            </w:r>
+            <w:r>
+              <w:rPr>
+                <w:noProof/>
+                <w:webHidden/>
+              </w:rPr>
+              <w:fldChar w:fldCharType="separate"/>
+            </w:r>
+            <w:r>
+              <w:rPr>
+                <w:noProof/>
+                <w:webHidden/>
+              </w:rPr>
+              <w:t>11</w:t>
+            </w:r>
+            <w:r>
+              <w:rPr>
+                <w:noProof/>
+                <w:webHidden/>
+              </w:rPr>
+              <w:fldChar w:fldCharType="end"/>
+            </w:r>
+          </w:hyperlink>
+        </w:p>
+        <w:p>
+          <w:pPr>
+            <w:pStyle w:val="TOC3"/>
+            <w:tabs>
+              <w:tab w:val="left" w:pos="1200"/>
+              <w:tab w:val="right" w:leader="dot" w:pos="10790"/>
+            </w:tabs>
+            <w:rPr>
+              <w:rFonts w:eastAsiaTheme="minorEastAsia"/>
+              <w:noProof/>
+              <w:sz w:val="24"/>
+              <w:szCs w:val="24"/>
+              <w:lang w:eastAsia="zh-CN"/>
+            </w:rPr>
+          </w:pPr>
+          <w:hyperlink w:anchor="_Toc237911251" w:history="1">
+            <w:r>
+              <w:rPr>
+                <w:rStyle w:val="Hyperlink"/>
+                <w:noProof/>
+              </w:rPr>
+              <w:t>3.2.1</w:t>
+            </w:r>
+            <w:r>
+              <w:rPr>
+                <w:rFonts w:eastAsiaTheme="minorEastAsia"/>
+                <w:noProof/>
+                <w:sz w:val="24"/>
+                <w:szCs w:val="24"/>
+                <w:lang w:eastAsia="zh-CN"/>
+              </w:rPr>
+              <w:tab/>
+            </w:r>
+            <w:r>
+              <w:rPr>
+                <w:rStyle w:val="Hyperlink"/>
+                <w:noProof/>
+              </w:rPr>
+              <w:t>Enable or Disable the Bootloader Pin</w:t>
+            </w:r>
+            <w:r>
+              <w:rPr>
+                <w:noProof/>
+                <w:webHidden/>
+              </w:rPr>
+              <w:tab/>
+            </w:r>
+            <w:r>
+              <w:rPr>
+                <w:noProof/>
+                <w:webHidden/>
+              </w:rPr>
+              <w:fldChar w:fldCharType="begin"/>
+            </w:r>
+            <w:r>
+              <w:rPr>
+                <w:noProof/>
+                <w:webHidden/>
+              </w:rPr>
+              <w:instrText xml:space="preserve"> PAGEREF _Toc237911251 \h </w:instrText>
+            </w:r>
+            <w:r>
+              <w:rPr>
+                <w:noProof/>
+                <w:webHidden/>
+              </w:rPr>
+            </w:r>
+            <w:r>
+              <w:rPr>
+                <w:noProof/>
+                <w:webHidden/>
+              </w:rPr>
+              <w:fldChar w:fldCharType="separate"/>
+            </w:r>
+            <w:r>
+              <w:rPr>
+                <w:noProof/>
+                <w:webHidden/>
+              </w:rPr>
+              <w:t>11</w:t>
+            </w:r>
+            <w:r>
+              <w:rPr>
+                <w:noProof/>
+                <w:webHidden/>
+              </w:rPr>
+              <w:fldChar w:fldCharType="end"/>
+            </w:r>
+          </w:hyperlink>
+        </w:p>
+        <w:p>
+          <w:pPr>
+            <w:pStyle w:val="TOC3"/>
+            <w:tabs>
+              <w:tab w:val="left" w:pos="1200"/>
+              <w:tab w:val="right" w:leader="dot" w:pos="10790"/>
+            </w:tabs>
+            <w:rPr>
+              <w:rFonts w:eastAsiaTheme="minorEastAsia"/>
+              <w:noProof/>
+              <w:sz w:val="24"/>
+              <w:szCs w:val="24"/>
+              <w:lang w:eastAsia="zh-CN"/>
+            </w:rPr>
+          </w:pPr>
+          <w:hyperlink w:anchor="_Toc237911252" w:history="1">
+            <w:r>
+              <w:rPr>
+                <w:rStyle w:val="Hyperlink"/>
+                <w:noProof/>
+              </w:rPr>
+              <w:t>3.2.2</w:t>
+            </w:r>
+            <w:r>
+              <w:rPr>
+                <w:rFonts w:eastAsiaTheme="minorEastAsia"/>
+                <w:noProof/>
+                <w:sz w:val="24"/>
+                <w:szCs w:val="24"/>
+                <w:lang w:eastAsia="zh-CN"/>
+              </w:rPr>
+              <w:tab/>
+            </w:r>
+            <w:r>
+              <w:rPr>
+                <w:rStyle w:val="Hyperlink"/>
+                <w:noProof/>
+              </w:rPr>
+              <w:t>Query the Bootloader Pin</w:t>
+            </w:r>
+            <w:r>
+              <w:rPr>
+                <w:noProof/>
+                <w:webHidden/>
+              </w:rPr>
+              <w:tab/>
+            </w:r>
+            <w:r>
+              <w:rPr>
+                <w:noProof/>
+                <w:webHidden/>
+              </w:rPr>
+              <w:fldChar w:fldCharType="begin"/>
+            </w:r>
+            <w:r>
+              <w:rPr>
+                <w:noProof/>
+                <w:webHidden/>
+              </w:rPr>
+              <w:instrText xml:space="preserve"> PAGEREF _Toc237911252 \h </w:instrText>
             </w:r>
             <w:r>
               <w:rPr>
@@ -1819,7 +1981,7 @@
                 <w:rStyle w:val="Hyperlink"/>
                 <w:noProof/>
               </w:rPr>
-              <w:t>4.3</w:t>
+              <w:t>3.3</w:t>
             </w:r>
             <w:r>
               <w:rPr>
@@ -1909,7 +2071,7 @@
                 <w:rStyle w:val="Hyperlink"/>
                 <w:noProof/>
               </w:rPr>
-              <w:t>4.4</w:t>
+              <w:t>3.4</w:t>
             </w:r>
             <w:r>
               <w:rPr>
@@ -1999,7 +2161,7 @@
                 <w:rStyle w:val="Hyperlink"/>
                 <w:noProof/>
               </w:rPr>
-              <w:t>4.4.1</w:t>
+              <w:t>3.4.1</w:t>
             </w:r>
             <w:r>
               <w:rPr>
@@ -2089,7 +2251,7 @@
                 <w:rStyle w:val="Hyperlink"/>
                 <w:noProof/>
               </w:rPr>
-              <w:t>4.4.2</w:t>
+              <w:t>3.4.2</w:t>
             </w:r>
             <w:r>
               <w:rPr>
@@ -2179,7 +2341,7 @@
                 <w:rStyle w:val="Hyperlink"/>
                 <w:noProof/>
               </w:rPr>
-              <w:t>4.5</w:t>
+              <w:t>3.5</w:t>
             </w:r>
             <w:r>
               <w:rPr>
@@ -2269,7 +2431,7 @@
                 <w:rStyle w:val="Hyperlink"/>
                 <w:noProof/>
               </w:rPr>
-              <w:t>4.5.1</w:t>
+              <w:t>3.5.1</w:t>
             </w:r>
             <w:r>
               <w:rPr>
@@ -2359,7 +2521,7 @@
                 <w:rStyle w:val="Hyperlink"/>
                 <w:noProof/>
               </w:rPr>
-              <w:t>4.5.2</w:t>
+              <w:t>3.5.2</w:t>
             </w:r>
             <w:r>
               <w:rPr>
@@ -2449,7 +2611,7 @@
                 <w:rStyle w:val="Hyperlink"/>
                 <w:noProof/>
               </w:rPr>
-              <w:t>4.6</w:t>
+              <w:t>3.6</w:t>
             </w:r>
             <w:r>
               <w:rPr>
@@ -2539,7 +2701,7 @@
                 <w:rStyle w:val="Hyperlink"/>
                 <w:noProof/>
               </w:rPr>
-              <w:t>4.6.1</w:t>
+              <w:t>3.6.1</w:t>
             </w:r>
             <w:r>
               <w:rPr>
@@ -2629,7 +2791,7 @@
                 <w:rStyle w:val="Hyperlink"/>
                 <w:noProof/>
               </w:rPr>
-              <w:t>4.6.2</w:t>
+              <w:t>3.6.2</w:t>
             </w:r>
             <w:r>
               <w:rPr>
@@ -2719,7 +2881,7 @@
                 <w:rStyle w:val="Hyperlink"/>
                 <w:noProof/>
               </w:rPr>
-              <w:t>4.7</w:t>
+              <w:t>3.7</w:t>
             </w:r>
             <w:r>
               <w:rPr>
@@ -2809,7 +2971,7 @@
                 <w:rStyle w:val="Hyperlink"/>
                 <w:noProof/>
               </w:rPr>
-              <w:t>4.7.1</w:t>
+              <w:t>3.7.1</w:t>
             </w:r>
             <w:r>
               <w:rPr>
@@ -2899,7 +3061,7 @@
                 <w:rStyle w:val="Hyperlink"/>
                 <w:noProof/>
               </w:rPr>
-              <w:t>4.7.2</w:t>
+              <w:t>3.7.2</w:t>
             </w:r>
             <w:r>
               <w:rPr>
@@ -2989,7 +3151,7 @@
                 <w:rStyle w:val="Hyperlink"/>
                 <w:noProof/>
               </w:rPr>
-              <w:t>4.8</w:t>
+              <w:t>3.8</w:t>
             </w:r>
             <w:r>
               <w:rPr>
@@ -3079,7 +3241,7 @@
                 <w:rStyle w:val="Hyperlink"/>
                 <w:noProof/>
               </w:rPr>
-              <w:t>4.8.1</w:t>
+              <w:t>3.8.1</w:t>
             </w:r>
             <w:r>
               <w:rPr>
@@ -3169,7 +3331,7 @@
                 <w:rStyle w:val="Hyperlink"/>
                 <w:noProof/>
               </w:rPr>
-              <w:t>4.8.2</w:t>
+              <w:t>3.8.2</w:t>
             </w:r>
             <w:r>
               <w:rPr>
@@ -3259,7 +3421,7 @@
                 <w:rStyle w:val="Hyperlink"/>
                 <w:noProof/>
               </w:rPr>
-              <w:t>4.9</w:t>
+              <w:t>3.9</w:t>
             </w:r>
             <w:r>
               <w:rPr>
@@ -3349,7 +3511,7 @@
                 <w:rStyle w:val="Hyperlink"/>
                 <w:noProof/>
               </w:rPr>
-              <w:t>4.9.1</w:t>
+              <w:t>3.9.1</w:t>
             </w:r>
             <w:r>
               <w:rPr>
@@ -3439,7 +3601,7 @@
                 <w:rStyle w:val="Hyperlink"/>
                 <w:noProof/>
               </w:rPr>
-              <w:t>4.9.2</w:t>
+              <w:t>3.9.2</w:t>
             </w:r>
             <w:r>
               <w:rPr>
@@ -3529,7 +3691,7 @@
                 <w:rStyle w:val="Hyperlink"/>
                 <w:noProof/>
               </w:rPr>
-              <w:t>4.10</w:t>
+              <w:t>3.10</w:t>
             </w:r>
             <w:r>
               <w:rPr>
@@ -3619,7 +3781,7 @@
                 <w:rStyle w:val="Hyperlink"/>
                 <w:noProof/>
               </w:rPr>
-              <w:t>4.11</w:t>
+              <w:t>3.11</w:t>
             </w:r>
             <w:r>
               <w:rPr>
@@ -3709,7 +3871,7 @@
                 <w:rStyle w:val="Hyperlink"/>
                 <w:noProof/>
               </w:rPr>
-              <w:t>4.11.1</w:t>
+              <w:t>3.11.1</w:t>
             </w:r>
             <w:r>
               <w:rPr>
@@ -3799,7 +3961,7 @@
                 <w:rStyle w:val="Hyperlink"/>
                 <w:noProof/>
               </w:rPr>
-              <w:t>4.11.2</w:t>
+              <w:t>3.11.2</w:t>
             </w:r>
             <w:r>
               <w:rPr>
@@ -3889,7 +4051,7 @@
                 <w:rStyle w:val="Hyperlink"/>
                 <w:noProof/>
               </w:rPr>
-              <w:t>4.12</w:t>
+              <w:t>3.12</w:t>
             </w:r>
             <w:r>
               <w:rPr>
@@ -3979,7 +4141,7 @@
                 <w:rStyle w:val="Hyperlink"/>
                 <w:noProof/>
               </w:rPr>
-              <w:t>4.12.1</w:t>
+              <w:t>3.12.1</w:t>
             </w:r>
             <w:r>
               <w:rPr>
@@ -4069,7 +4231,7 @@
                 <w:rStyle w:val="Hyperlink"/>
                 <w:noProof/>
               </w:rPr>
-              <w:t>4.12.2</w:t>
+              <w:t>3.12.2</w:t>
             </w:r>
             <w:r>
               <w:rPr>
@@ -4159,7 +4321,7 @@
                 <w:rStyle w:val="Hyperlink"/>
                 <w:noProof/>
               </w:rPr>
-              <w:t>4.13</w:t>
+              <w:t>3.13</w:t>
             </w:r>
             <w:r>
               <w:rPr>
@@ -4249,7 +4411,7 @@
                 <w:rStyle w:val="Hyperlink"/>
                 <w:noProof/>
               </w:rPr>
-              <w:t>4.14</w:t>
+              <w:t>3.14</w:t>
             </w:r>
             <w:r>
               <w:rPr>
@@ -4339,7 +4501,7 @@
                 <w:rStyle w:val="Hyperlink"/>
                 <w:noProof/>
               </w:rPr>
-              <w:t>4.14.1</w:t>
+              <w:t>3.14.1</w:t>
             </w:r>
             <w:r>
               <w:rPr>
@@ -4429,7 +4591,7 @@
                 <w:rStyle w:val="Hyperlink"/>
                 <w:noProof/>
               </w:rPr>
-              <w:t>4.14.2</w:t>
+              <w:t>3.14.2</w:t>
             </w:r>
             <w:r>
               <w:rPr>
@@ -4519,7 +4681,7 @@
                 <w:rStyle w:val="Hyperlink"/>
                 <w:noProof/>
               </w:rPr>
-              <w:t>4.14.3</w:t>
+              <w:t>3.14.3</w:t>
             </w:r>
             <w:r>
               <w:rPr>
@@ -4609,7 +4771,7 @@
                 <w:rStyle w:val="Hyperlink"/>
                 <w:noProof/>
               </w:rPr>
-              <w:t>4.14.4</w:t>
+              <w:t>3.14.4</w:t>
             </w:r>
             <w:r>
               <w:rPr>
@@ -4699,7 +4861,7 @@
                 <w:rStyle w:val="Hyperlink"/>
                 <w:noProof/>
               </w:rPr>
-              <w:t>4.14.5</w:t>
+              <w:t>3.14.5</w:t>
             </w:r>
             <w:r>
               <w:rPr>
@@ -4789,7 +4951,7 @@
                 <w:rStyle w:val="Hyperlink"/>
                 <w:noProof/>
               </w:rPr>
-              <w:t>4.15</w:t>
+              <w:t>3.15</w:t>
             </w:r>
             <w:r>
               <w:rPr>
@@ -4879,7 +5041,7 @@
                 <w:rStyle w:val="Hyperlink"/>
                 <w:noProof/>
               </w:rPr>
-              <w:t>4.15.1</w:t>
+              <w:t>3.15.1</w:t>
             </w:r>
             <w:r>
               <w:rPr>
@@ -4969,7 +5131,7 @@
                 <w:rStyle w:val="Hyperlink"/>
                 <w:noProof/>
               </w:rPr>
-              <w:t>4.15.2</w:t>
+              <w:t>3.15.2</w:t>
             </w:r>
             <w:r>
               <w:rPr>
@@ -5059,7 +5221,7 @@
                 <w:rStyle w:val="Hyperlink"/>
                 <w:noProof/>
               </w:rPr>
-              <w:t>4.16</w:t>
+              <w:t>3.16</w:t>
             </w:r>
             <w:r>
               <w:rPr>
@@ -5149,7 +5311,7 @@
                 <w:rStyle w:val="Hyperlink"/>
                 <w:noProof/>
               </w:rPr>
-              <w:t>4.16.1</w:t>
+              <w:t>3.16.1</w:t>
             </w:r>
             <w:r>
               <w:rPr>
@@ -5239,7 +5401,7 @@
                 <w:rStyle w:val="Hyperlink"/>
                 <w:noProof/>
               </w:rPr>
-              <w:t>4.16.2</w:t>
+              <w:t>3.16.2</w:t>
             </w:r>
             <w:r>
               <w:rPr>
@@ -5329,7 +5491,7 @@
                 <w:rStyle w:val="Hyperlink"/>
                 <w:noProof/>
               </w:rPr>
-              <w:t>4.16.3</w:t>
+              <w:t>3.16.3</w:t>
             </w:r>
             <w:r>
               <w:rPr>
@@ -5419,7 +5581,7 @@
                 <w:rStyle w:val="Hyperlink"/>
                 <w:noProof/>
               </w:rPr>
-              <w:t>5</w:t>
+              <w:t>4</w:t>
             </w:r>
             <w:r>
               <w:rPr>
@@ -5509,7 +5671,7 @@
                 <w:rStyle w:val="Hyperlink"/>
                 <w:noProof/>
               </w:rPr>
-              <w:t>5.1</w:t>
+              <w:t>4.1</w:t>
             </w:r>
             <w:r>
               <w:rPr>
@@ -5599,7 +5761,7 @@
                 <w:rStyle w:val="Hyperlink"/>
                 <w:noProof/>
               </w:rPr>
-              <w:t>5.1.1</w:t>
+              <w:t>4.1.1</w:t>
             </w:r>
             <w:r>
               <w:rPr>
@@ -5689,7 +5851,7 @@
                 <w:rStyle w:val="Hyperlink"/>
                 <w:noProof/>
               </w:rPr>
-              <w:t>5.1.2</w:t>
+              <w:t>4.1.2</w:t>
             </w:r>
             <w:r>
               <w:rPr>
@@ -5779,7 +5941,7 @@
                 <w:rStyle w:val="Hyperlink"/>
                 <w:noProof/>
               </w:rPr>
-              <w:t>5.1.3</w:t>
+              <w:t>4.1.3</w:t>
             </w:r>
             <w:r>
               <w:rPr>
@@ -5869,7 +6031,7 @@
                 <w:rStyle w:val="Hyperlink"/>
                 <w:noProof/>
               </w:rPr>
-              <w:t>5.1.4</w:t>
+              <w:t>4.1.4</w:t>
             </w:r>
             <w:r>
               <w:rPr>
@@ -5959,7 +6121,7 @@
                 <w:rStyle w:val="Hyperlink"/>
                 <w:noProof/>
               </w:rPr>
-              <w:t>5.2</w:t>
+              <w:t>4.2</w:t>
             </w:r>
             <w:r>
               <w:rPr>
@@ -6049,7 +6211,7 @@
                 <w:rStyle w:val="Hyperlink"/>
                 <w:noProof/>
               </w:rPr>
-              <w:t>5.3</w:t>
+              <w:t>4.3</w:t>
             </w:r>
             <w:r>
               <w:rPr>
@@ -6140,7 +6302,7 @@
                 <w:noProof/>
                 <w:lang w:eastAsia="zh-CN"/>
               </w:rPr>
-              <w:t>5.3.1</w:t>
+              <w:t>4.3.1</w:t>
             </w:r>
             <w:r>
               <w:rPr>
@@ -6262,7 +6424,7 @@
                 <w:rStyle w:val="Hyperlink"/>
                 <w:noProof/>
               </w:rPr>
-              <w:t>5.3.2</w:t>
+              <w:t>4.3.2</w:t>
             </w:r>
             <w:r>
               <w:rPr>
@@ -6352,7 +6514,7 @@
                 <w:rStyle w:val="Hyperlink"/>
                 <w:noProof/>
               </w:rPr>
-              <w:t>5.3.3</w:t>
+              <w:t>4.3.3</w:t>
             </w:r>
             <w:r>
               <w:rPr>
@@ -6442,7 +6604,7 @@
                 <w:rStyle w:val="Hyperlink"/>
                 <w:noProof/>
               </w:rPr>
-              <w:t>5.3.4</w:t>
+              <w:t>4.3.4</w:t>
             </w:r>
             <w:r>
               <w:rPr>
@@ -6532,7 +6694,7 @@
                 <w:rStyle w:val="Hyperlink"/>
                 <w:noProof/>
               </w:rPr>
-              <w:t>5.4</w:t>
+              <w:t>4.4</w:t>
             </w:r>
             <w:r>
               <w:rPr>
@@ -6622,7 +6784,7 @@
                 <w:rStyle w:val="Hyperlink"/>
                 <w:noProof/>
               </w:rPr>
-              <w:t>5.4.1</w:t>
+              <w:t>4.4.1</w:t>
             </w:r>
             <w:r>
               <w:rPr>
@@ -6712,7 +6874,7 @@
                 <w:rStyle w:val="Hyperlink"/>
                 <w:noProof/>
               </w:rPr>
-              <w:t>5.4.2</w:t>
+              <w:t>4.4.2</w:t>
             </w:r>
             <w:r>
               <w:rPr>
@@ -6802,7 +6964,7 @@
                 <w:rStyle w:val="Hyperlink"/>
                 <w:noProof/>
               </w:rPr>
-              <w:t>5.5</w:t>
+              <w:t>4.5</w:t>
             </w:r>
             <w:r>
               <w:rPr>
@@ -6892,7 +7054,7 @@
                 <w:rStyle w:val="Hyperlink"/>
                 <w:noProof/>
               </w:rPr>
-              <w:t>5.5.1</w:t>
+              <w:t>4.5.1</w:t>
             </w:r>
             <w:r>
               <w:rPr>
@@ -6982,7 +7144,7 @@
                 <w:rStyle w:val="Hyperlink"/>
                 <w:noProof/>
               </w:rPr>
-              <w:t>5.5.2</w:t>
+              <w:t>4.5.2</w:t>
             </w:r>
             <w:r>
               <w:rPr>
@@ -7072,7 +7234,7 @@
                 <w:rStyle w:val="Hyperlink"/>
                 <w:noProof/>
               </w:rPr>
-              <w:t>5.5.3</w:t>
+              <w:t>4.5.3</w:t>
             </w:r>
             <w:r>
               <w:rPr>
@@ -7162,7 +7324,7 @@
                 <w:rStyle w:val="Hyperlink"/>
                 <w:noProof/>
               </w:rPr>
-              <w:t>5.6</w:t>
+              <w:t>4.6</w:t>
             </w:r>
             <w:r>
               <w:rPr>
@@ -7252,7 +7414,7 @@
                 <w:rStyle w:val="Hyperlink"/>
                 <w:noProof/>
               </w:rPr>
-              <w:t>5.6.1</w:t>
+              <w:t>4.6.1</w:t>
             </w:r>
             <w:r>
               <w:rPr>
@@ -7342,7 +7504,7 @@
                 <w:rStyle w:val="Hyperlink"/>
                 <w:noProof/>
               </w:rPr>
-              <w:t>5.6.2</w:t>
+              <w:t>4.6.2</w:t>
             </w:r>
             <w:r>
               <w:rPr>
@@ -7555,11 +7717,13 @@
       <w:pPr>
         <w:pStyle w:val="Heading1"/>
       </w:pPr>
+      <w:bookmarkStart w:id="109" w:name="_Toc237911178"/>
       <w:r>
         <w:lastRenderedPageBreak/>
         <w:t>Overview</w:t>
       </w:r>
       <w:bookmarkEnd w:id="4"/>
+      <w:bookmarkEnd w:id="109"/>
     </w:p>
     <w:p>
       <w:r>
@@ -9753,7 +9917,7 @@
         <w:t xml:space="preserve">Warning: </w:t>
       </w:r>
       <w:r>
-        <w:t>With the backdoor disabled, SYNC no longer enters the bootloader, so the ADSBee 1421 Programmer and other SYNC-based tools cannot reflash the module. The Programmer (0.3.11-rc4 and later) still bridges the console, without checking the image, so AT+BOOTLOADER_PIN=1,DEADBEE can be sent through it. The only ways to enable it again are AT+BOOTLOADER_PIN=1,DEADBEE sent to the running firmware, or a JTAG flash. Flashing a complete firmware image writes that image's CCFG, which has the backdoor enabled in every release.</w:t>
+        <w:t>With the backdoor disabled, SYNC no longer enters the bootloader, so the ADSBee 1421 Programmer and other SYNC-based tools cannot reflash the module. The Programmer (0.3.11 and later) still bridges the console, without checking the image, so AT+BOOTLOADER_PIN=1,DEADBEE can be sent through it. The only ways to enable it again are AT+BOOTLOADER_PIN=1,DEADBEE sent to the running firmware, or a JTAG flash. Flashing a complete firmware image writes that image's CCFG, which has the backdoor enabled in every release.</w:t>
       </w:r>
     </w:p>
     <w:p>
@@ -9764,9 +9928,11 @@
           <w:numId w:val="4"/>
         </w:numPr>
       </w:pPr>
+      <w:bookmarkStart w:id="110" w:name="_Toc237911251"/>
       <w:r>
         <w:t>Enable or Disable the Bootloader Pin</w:t>
       </w:r>
+      <w:bookmarkEnd w:id="110"/>
     </w:p>
     <w:p>
       <w:pPr>
@@ -9987,9 +10153,11 @@
           <w:numId w:val="4"/>
         </w:numPr>
       </w:pPr>
+      <w:bookmarkStart w:id="111" w:name="_Toc237911252"/>
       <w:r>
         <w:t>Query the Bootloader Pin</w:t>
       </w:r>
+      <w:bookmarkEnd w:id="111"/>
     </w:p>
     <w:p>
       <w:pPr>
@@ -10113,7 +10281,7 @@
     </w:p>
     <w:p>
       <w:r>
-        <w:t>The Firmware Build line reads Debug or Release (firmware 0.3.11-rc6 and later). Debug builds add the RF test command AT+TX_CW, which transmits an unmodulated carrier for conducted bench measurements into an attenuator or dummy load. Release builds, including all published releases, don't contain it. To make a Debug build, run ./build.sh -d build_and_flash in firmware/adsbee_1421 (see firmware/README.md).</w:t>
+        <w:t>The Firmware Build line reads Debug or Release (firmware 0.3.11 and later). Debug builds add the RF test command AT+TX_CW, which transmits an unmodulated carrier for conducted bench measurements into an attenuator or dummy load. Release builds, including all published releases, don't contain it. To make a Debug build, run ./build.sh -d build_and_flash in firmware/adsbee_1421 (see firmware/README.md).</w:t>
       </w:r>
     </w:p>
     <w:p>
@@ -36640,7 +36808,7 @@
       <w:rPr>
         <w:color w:val="FFFFFF" w:themeColor="background1"/>
       </w:rPr>
-      <w:t>10</w:t>
+      <w:t>11</w:t>
     </w:r>
   </w:p>
 </w:ftr>

</xml_diff>

<commit_message>
m1421 datasheet: UAT dynamic range in dB, 20261007 revision, TOC pages clear of the header logo
- Quick Specs: UAT: 87 dB (was 87dBm); docs/adsbee-1421/m1421.md matches
- revision history entry 20261007; Document Version 20261007 (date of the last revision)
- the page break before Overview is now a section break, so the TOC and revision history
  pages get a 0.8 in top margin: the header logo hangs below the 0.5 in margin and covered
  the first TOC line on pages 3 and 4
</commit_message>
<xml_diff>
--- a/word/datasheet_adsbee_m1421.docx
+++ b/word/datasheet_adsbee_m1421.docx
@@ -385,7 +385,7 @@
           </w:p>
           <w:p>
             <w:r>
-              <w:t>UAT: 87dBm</w:t>
+              <w:t>UAT: 87 dB</w:t>
             </w:r>
           </w:p>
         </w:tc>
@@ -7698,6 +7698,23 @@
         <w:t>AT+R1090_PREAMBLE now has two modes: MODE_S (new default, every downlink format) and DF17 (DF17 frames only). AT+R1090_GAIN AUTO is automatic gain control in DF17 and gain step 13 in MODE_S. Saved settings reset to factory defaults when upgrading to this firmware.</w:t>
       </w:r>
     </w:p>
+    <w:p>
+      <w:r>
+        <w:t>20261007</w:t>
+      </w:r>
+    </w:p>
+    <w:p>
+      <w:pPr>
+        <w:pStyle w:val="ListParagraph"/>
+        <w:numPr>
+          <w:ilvl w:val="0"/>
+          <w:numId w:val="5"/>
+        </w:numPr>
+      </w:pPr>
+      <w:r>
+        <w:t>Rebuilt the table of contents to match the section numbers and pages. Firmware references updated to 0.3.11. Dynamic range is now -90 to 0 dBm for Mode S and 87 dB for UAT.</w:t>
+      </w:r>
+    </w:p>
     <w:p/>
     <w:p>
       <w:pPr>
@@ -7708,10 +7725,13 @@
           <w:sz w:val="32"/>
           <w:szCs w:val="32"/>
         </w:rPr>
+        <w:sectPr>
+          <w:pgSz w:w="12240" w:h="15840"/>
+          <w:pgMar w:top="1152" w:right="720" w:bottom="720" w:left="720" w:header="288" w:footer="288" w:gutter="0"/>
+          <w:cols w:space="720"/>
+          <w:docGrid w:linePitch="360"/>
+        </w:sectPr>
       </w:pPr>
-      <w:r>
-        <w:br w:type="page"/>
-      </w:r>
     </w:p>
     <w:p>
       <w:pPr>
@@ -36789,7 +36809,7 @@
       <w:rPr>
         <w:color w:val="FFFFFF" w:themeColor="background1"/>
       </w:rPr>
-      <w:t>006</w:t>
+      <w:t>007</w:t>
     </w:r>
     <w:r>
       <w:rPr>

</xml_diff>